<commit_message>
Submit tool catalogue and schemas #123tp5x7wmq[COMPLETED]
</commit_message>
<xml_diff>
--- a/docs/requirements/Week4_Tool_Catalogue.docx
+++ b/docs/requirements/Week4_Tool_Catalogue.docx
@@ -150,16 +150,7 @@
           <w:sz w:val="22"/>
           <w:szCs w:val="22"/>
         </w:rPr>
-        <w:t xml:space="preserve">This document defines four tools for the prototype: their purpose, input/output schemas, authorization requirements, and failure-handling </w:t>
-      </w:r>
-      <w:proofErr w:type="spellStart"/>
-      <w:r>
-        <w:rPr>
-          <w:rFonts w:ascii="Calibri" w:eastAsia="Calibri" w:hAnsi="Calibri" w:cs="Calibri"/>
-          <w:sz w:val="22"/>
-          <w:szCs w:val="22"/>
-        </w:rPr>
-        <w:t>behav</w:t>
+        <w:t>This document defines four tools for the prototype: their purpose, input/output schemas, authorization requirements, and failure-handling behav</w:t>
       </w:r>
       <w:r>
         <w:rPr>
@@ -175,16 +166,7 @@
           <w:sz w:val="22"/>
           <w:szCs w:val="22"/>
         </w:rPr>
-        <w:t>our</w:t>
-      </w:r>
-      <w:proofErr w:type="spellEnd"/>
-      <w:r>
-        <w:rPr>
-          <w:rFonts w:ascii="Calibri" w:eastAsia="Calibri" w:hAnsi="Calibri" w:cs="Calibri"/>
-          <w:sz w:val="22"/>
-          <w:szCs w:val="22"/>
-        </w:rPr>
-        <w:t>. All tools described here are proposed tools for the academic prototype. They are not real Centenary Bank production endpoints, and the agent does not have and must never claim to have access to live banking systems.</w:t>
+        <w:t>our. All tools described here are proposed tools for the academic prototype. They are not real Centenary Bank production endpoints, and the agent does not have and must never claim to have access to live banking systems.</w:t>
       </w:r>
     </w:p>
     <w:p>
@@ -251,12 +233,6 @@
         <w:gridCol w:w="3878"/>
       </w:tblGrid>
       <w:tr>
-        <w:tblPrEx>
-          <w:tblCellMar>
-            <w:top w:w="0" w:type="dxa"/>
-            <w:bottom w:w="0" w:type="dxa"/>
-          </w:tblCellMar>
-        </w:tblPrEx>
         <w:trPr>
           <w:tblHeader/>
         </w:trPr>
@@ -352,12 +328,6 @@
         </w:tc>
       </w:tr>
       <w:tr>
-        <w:tblPrEx>
-          <w:tblCellMar>
-            <w:top w:w="0" w:type="dxa"/>
-            <w:bottom w:w="0" w:type="dxa"/>
-          </w:tblCellMar>
-        </w:tblPrEx>
         <w:tc>
           <w:tcPr>
             <w:tcW w:w="1100" w:type="pct"/>
@@ -438,12 +408,6 @@
         </w:tc>
       </w:tr>
       <w:tr>
-        <w:tblPrEx>
-          <w:tblCellMar>
-            <w:top w:w="0" w:type="dxa"/>
-            <w:bottom w:w="0" w:type="dxa"/>
-          </w:tblCellMar>
-        </w:tblPrEx>
         <w:tc>
           <w:tcPr>
             <w:tcW w:w="1100" w:type="pct"/>
@@ -608,19 +572,8 @@
           <w:bCs/>
           <w:color w:val="1F3864"/>
         </w:rPr>
-        <w:t xml:space="preserve">Tool 1: </w:t>
+        <w:t>Tool 1: get_service_status</w:t>
       </w:r>
-      <w:proofErr w:type="spellStart"/>
-      <w:r>
-        <w:rPr>
-          <w:rFonts w:ascii="Calibri" w:eastAsia="Calibri" w:hAnsi="Calibri" w:cs="Calibri"/>
-          <w:b/>
-          <w:bCs/>
-          <w:color w:val="1F3864"/>
-        </w:rPr>
-        <w:t>get_service_status</w:t>
-      </w:r>
-      <w:proofErr w:type="spellEnd"/>
     </w:p>
     <w:p>
       <w:pPr>
@@ -657,43 +610,13 @@
         </w:rPr>
         <w:t xml:space="preserve"> </w:t>
       </w:r>
-      <w:proofErr w:type="spellStart"/>
-      <w:proofErr w:type="gramStart"/>
       <w:r>
         <w:rPr>
           <w:rFonts w:ascii="Calibri" w:eastAsia="Calibri" w:hAnsi="Calibri" w:cs="Calibri"/>
           <w:sz w:val="22"/>
           <w:szCs w:val="22"/>
         </w:rPr>
-        <w:t>Lets</w:t>
-      </w:r>
-      <w:proofErr w:type="spellEnd"/>
-      <w:proofErr w:type="gramEnd"/>
-      <w:r>
-        <w:rPr>
-          <w:rFonts w:ascii="Calibri" w:eastAsia="Calibri" w:hAnsi="Calibri" w:cs="Calibri"/>
-          <w:sz w:val="22"/>
-          <w:szCs w:val="22"/>
-        </w:rPr>
-        <w:t xml:space="preserve"> the agent answer “is X working right now?” questions with current information instead of a static, possibly outdated, knowledge-</w:t>
-      </w:r>
-      <w:proofErr w:type="spellStart"/>
-      <w:r>
-        <w:rPr>
-          <w:rFonts w:ascii="Calibri" w:eastAsia="Calibri" w:hAnsi="Calibri" w:cs="Calibri"/>
-          <w:sz w:val="22"/>
-          <w:szCs w:val="22"/>
-        </w:rPr>
-        <w:t>base</w:t>
-      </w:r>
-      <w:proofErr w:type="spellEnd"/>
-      <w:r>
-        <w:rPr>
-          <w:rFonts w:ascii="Calibri" w:eastAsia="Calibri" w:hAnsi="Calibri" w:cs="Calibri"/>
-          <w:sz w:val="22"/>
-          <w:szCs w:val="22"/>
-        </w:rPr>
-        <w:t xml:space="preserve"> answer. Read-only </w:t>
+        <w:t xml:space="preserve">Lets the agent answer “is X working right now?” questions with current information instead of a static, possibly outdated, knowledge-base answer. Read-only </w:t>
       </w:r>
       <w:r>
         <w:rPr>
@@ -751,12 +674,6 @@
         <w:gridCol w:w="2327"/>
       </w:tblGrid>
       <w:tr>
-        <w:tblPrEx>
-          <w:tblCellMar>
-            <w:top w:w="0" w:type="dxa"/>
-            <w:bottom w:w="0" w:type="dxa"/>
-          </w:tblCellMar>
-        </w:tblPrEx>
         <w:trPr>
           <w:tblHeader/>
         </w:trPr>
@@ -912,12 +829,6 @@
         </w:tc>
       </w:tr>
       <w:tr>
-        <w:tblPrEx>
-          <w:tblCellMar>
-            <w:top w:w="0" w:type="dxa"/>
-            <w:bottom w:w="0" w:type="dxa"/>
-          </w:tblCellMar>
-        </w:tblPrEx>
         <w:tc>
           <w:tcPr>
             <w:tcW w:w="800" w:type="pct"/>
@@ -936,14 +847,12 @@
             <w:vAlign w:val="center"/>
           </w:tcPr>
           <w:p>
-            <w:proofErr w:type="spellStart"/>
             <w:r>
               <w:rPr>
                 <w:rFonts w:ascii="Calibri" w:eastAsia="Calibri" w:hAnsi="Calibri" w:cs="Calibri"/>
               </w:rPr>
               <w:t>service_name</w:t>
             </w:r>
-            <w:proofErr w:type="spellEnd"/>
           </w:p>
         </w:tc>
         <w:tc>
@@ -1042,84 +951,12 @@
             <w:vAlign w:val="center"/>
           </w:tcPr>
           <w:p>
-            <w:proofErr w:type="spellStart"/>
-            <w:r>
-              <w:rPr>
-                <w:rFonts w:ascii="Calibri" w:eastAsia="Calibri" w:hAnsi="Calibri" w:cs="Calibri"/>
-              </w:rPr>
-              <w:t>mobile_banking</w:t>
-            </w:r>
-            <w:proofErr w:type="spellEnd"/>
-            <w:r>
-              <w:rPr>
-                <w:rFonts w:ascii="Calibri" w:eastAsia="Calibri" w:hAnsi="Calibri" w:cs="Calibri"/>
-              </w:rPr>
-              <w:t xml:space="preserve">, </w:t>
-            </w:r>
-            <w:proofErr w:type="spellStart"/>
-            <w:r>
-              <w:rPr>
-                <w:rFonts w:ascii="Calibri" w:eastAsia="Calibri" w:hAnsi="Calibri" w:cs="Calibri"/>
-              </w:rPr>
-              <w:t>internet_banking</w:t>
-            </w:r>
-            <w:proofErr w:type="spellEnd"/>
-            <w:r>
-              <w:rPr>
-                <w:rFonts w:ascii="Calibri" w:eastAsia="Calibri" w:hAnsi="Calibri" w:cs="Calibri"/>
-              </w:rPr>
-              <w:t xml:space="preserve">, </w:t>
-            </w:r>
-            <w:proofErr w:type="spellStart"/>
-            <w:r>
-              <w:rPr>
-                <w:rFonts w:ascii="Calibri" w:eastAsia="Calibri" w:hAnsi="Calibri" w:cs="Calibri"/>
-              </w:rPr>
-              <w:t>atm_network</w:t>
-            </w:r>
-            <w:proofErr w:type="spellEnd"/>
-            <w:r>
-              <w:rPr>
-                <w:rFonts w:ascii="Calibri" w:eastAsia="Calibri" w:hAnsi="Calibri" w:cs="Calibri"/>
-              </w:rPr>
-              <w:t xml:space="preserve">, </w:t>
-            </w:r>
-            <w:proofErr w:type="spellStart"/>
-            <w:r>
-              <w:rPr>
-                <w:rFonts w:ascii="Calibri" w:eastAsia="Calibri" w:hAnsi="Calibri" w:cs="Calibri"/>
-              </w:rPr>
-              <w:t>agent_banking</w:t>
-            </w:r>
-            <w:proofErr w:type="spellEnd"/>
-            <w:r>
-              <w:rPr>
-                <w:rFonts w:ascii="Calibri" w:eastAsia="Calibri" w:hAnsi="Calibri" w:cs="Calibri"/>
-              </w:rPr>
-              <w:t xml:space="preserve">, </w:t>
-            </w:r>
-            <w:proofErr w:type="spellStart"/>
-            <w:r>
-              <w:rPr>
-                <w:rFonts w:ascii="Calibri" w:eastAsia="Calibri" w:hAnsi="Calibri" w:cs="Calibri"/>
-              </w:rPr>
-              <w:t>card_services</w:t>
-            </w:r>
-            <w:proofErr w:type="spellEnd"/>
-            <w:r>
-              <w:rPr>
-                <w:rFonts w:ascii="Calibri" w:eastAsia="Calibri" w:hAnsi="Calibri" w:cs="Calibri"/>
-              </w:rPr>
-              <w:t xml:space="preserve">, </w:t>
-            </w:r>
-            <w:proofErr w:type="spellStart"/>
-            <w:r>
-              <w:rPr>
-                <w:rFonts w:ascii="Calibri" w:eastAsia="Calibri" w:hAnsi="Calibri" w:cs="Calibri"/>
-              </w:rPr>
-              <w:t>ussd_banking</w:t>
-            </w:r>
-            <w:proofErr w:type="spellEnd"/>
+            <w:r>
+              <w:rPr>
+                <w:rFonts w:ascii="Calibri" w:eastAsia="Calibri" w:hAnsi="Calibri" w:cs="Calibri"/>
+              </w:rPr>
+              <w:t>mobile_banking, internet_banking, atm_network, agent_banking, card_services, ussd_banking</w:t>
+            </w:r>
           </w:p>
         </w:tc>
       </w:tr>
@@ -1164,12 +1001,6 @@
         <w:gridCol w:w="9696"/>
       </w:tblGrid>
       <w:tr>
-        <w:tblPrEx>
-          <w:tblCellMar>
-            <w:top w:w="0" w:type="dxa"/>
-            <w:bottom w:w="0" w:type="dxa"/>
-          </w:tblCellMar>
-        </w:tblPrEx>
         <w:tc>
           <w:tcPr>
             <w:tcW w:w="5000" w:type="pct"/>
@@ -1204,53 +1035,7 @@
                 <w:sz w:val="18"/>
                 <w:szCs w:val="18"/>
               </w:rPr>
-              <w:t xml:space="preserve">  "</w:t>
-            </w:r>
-            <w:proofErr w:type="spellStart"/>
-            <w:proofErr w:type="gramStart"/>
-            <w:r>
-              <w:rPr>
-                <w:rFonts w:ascii="Consolas" w:eastAsia="Consolas" w:hAnsi="Consolas" w:cs="Consolas"/>
-                <w:sz w:val="18"/>
-                <w:szCs w:val="18"/>
-              </w:rPr>
-              <w:t>service</w:t>
-            </w:r>
-            <w:proofErr w:type="gramEnd"/>
-            <w:r>
-              <w:rPr>
-                <w:rFonts w:ascii="Consolas" w:eastAsia="Consolas" w:hAnsi="Consolas" w:cs="Consolas"/>
-                <w:sz w:val="18"/>
-                <w:szCs w:val="18"/>
-              </w:rPr>
-              <w:t>_name</w:t>
-            </w:r>
-            <w:proofErr w:type="spellEnd"/>
-            <w:r>
-              <w:rPr>
-                <w:rFonts w:ascii="Consolas" w:eastAsia="Consolas" w:hAnsi="Consolas" w:cs="Consolas"/>
-                <w:sz w:val="18"/>
-                <w:szCs w:val="18"/>
-              </w:rPr>
-              <w:t>": "</w:t>
-            </w:r>
-            <w:proofErr w:type="spellStart"/>
-            <w:r>
-              <w:rPr>
-                <w:rFonts w:ascii="Consolas" w:eastAsia="Consolas" w:hAnsi="Consolas" w:cs="Consolas"/>
-                <w:sz w:val="18"/>
-                <w:szCs w:val="18"/>
-              </w:rPr>
-              <w:t>mobile_banking</w:t>
-            </w:r>
-            <w:proofErr w:type="spellEnd"/>
-            <w:r>
-              <w:rPr>
-                <w:rFonts w:ascii="Consolas" w:eastAsia="Consolas" w:hAnsi="Consolas" w:cs="Consolas"/>
-                <w:sz w:val="18"/>
-                <w:szCs w:val="18"/>
-              </w:rPr>
-              <w:t>"</w:t>
+              <w:t xml:space="preserve">  "service_name": "mobile_banking"</w:t>
             </w:r>
           </w:p>
           <w:p>
@@ -1309,12 +1094,6 @@
         <w:gridCol w:w="2517"/>
       </w:tblGrid>
       <w:tr>
-        <w:tblPrEx>
-          <w:tblCellMar>
-            <w:top w:w="0" w:type="dxa"/>
-            <w:bottom w:w="0" w:type="dxa"/>
-          </w:tblCellMar>
-        </w:tblPrEx>
         <w:trPr>
           <w:tblHeader/>
         </w:trPr>
@@ -1440,12 +1219,6 @@
         </w:tc>
       </w:tr>
       <w:tr>
-        <w:tblPrEx>
-          <w:tblCellMar>
-            <w:top w:w="0" w:type="dxa"/>
-            <w:bottom w:w="0" w:type="dxa"/>
-          </w:tblCellMar>
-        </w:tblPrEx>
         <w:tc>
           <w:tcPr>
             <w:tcW w:w="1100" w:type="pct"/>
@@ -1464,14 +1237,12 @@
             <w:vAlign w:val="center"/>
           </w:tcPr>
           <w:p>
-            <w:proofErr w:type="spellStart"/>
             <w:r>
               <w:rPr>
                 <w:rFonts w:ascii="Calibri" w:eastAsia="Calibri" w:hAnsi="Calibri" w:cs="Calibri"/>
               </w:rPr>
               <w:t>status_code</w:t>
             </w:r>
-            <w:proofErr w:type="spellEnd"/>
           </w:p>
         </w:tc>
         <w:tc>
@@ -1554,12 +1325,6 @@
         </w:tc>
       </w:tr>
       <w:tr>
-        <w:tblPrEx>
-          <w:tblCellMar>
-            <w:top w:w="0" w:type="dxa"/>
-            <w:bottom w:w="0" w:type="dxa"/>
-          </w:tblCellMar>
-        </w:tblPrEx>
         <w:tc>
           <w:tcPr>
             <w:tcW w:w="1100" w:type="pct"/>
@@ -1670,12 +1435,6 @@
         </w:tc>
       </w:tr>
       <w:tr>
-        <w:tblPrEx>
-          <w:tblCellMar>
-            <w:top w:w="0" w:type="dxa"/>
-            <w:bottom w:w="0" w:type="dxa"/>
-          </w:tblCellMar>
-        </w:tblPrEx>
         <w:tc>
           <w:tcPr>
             <w:tcW w:w="1100" w:type="pct"/>
@@ -1694,28 +1453,12 @@
             <w:vAlign w:val="center"/>
           </w:tcPr>
           <w:p>
-            <w:proofErr w:type="gramStart"/>
-            <w:r>
-              <w:rPr>
-                <w:rFonts w:ascii="Calibri" w:eastAsia="Calibri" w:hAnsi="Calibri" w:cs="Calibri"/>
-              </w:rPr>
-              <w:t>services[].</w:t>
-            </w:r>
-            <w:proofErr w:type="spellStart"/>
-            <w:r>
-              <w:rPr>
-                <w:rFonts w:ascii="Calibri" w:eastAsia="Calibri" w:hAnsi="Calibri" w:cs="Calibri"/>
-              </w:rPr>
-              <w:t>service</w:t>
-            </w:r>
-            <w:proofErr w:type="gramEnd"/>
-            <w:r>
-              <w:rPr>
-                <w:rFonts w:ascii="Calibri" w:eastAsia="Calibri" w:hAnsi="Calibri" w:cs="Calibri"/>
-              </w:rPr>
-              <w:t>_name</w:t>
-            </w:r>
-            <w:proofErr w:type="spellEnd"/>
+            <w:r>
+              <w:rPr>
+                <w:rFonts w:ascii="Calibri" w:eastAsia="Calibri" w:hAnsi="Calibri" w:cs="Calibri"/>
+              </w:rPr>
+              <w:t>services[].service_name</w:t>
+            </w:r>
           </w:p>
         </w:tc>
         <w:tc>
@@ -1798,12 +1541,6 @@
         </w:tc>
       </w:tr>
       <w:tr>
-        <w:tblPrEx>
-          <w:tblCellMar>
-            <w:top w:w="0" w:type="dxa"/>
-            <w:bottom w:w="0" w:type="dxa"/>
-          </w:tblCellMar>
-        </w:tblPrEx>
         <w:tc>
           <w:tcPr>
             <w:tcW w:w="1100" w:type="pct"/>
@@ -1823,14 +1560,12 @@
             <w:vAlign w:val="center"/>
           </w:tcPr>
           <w:p>
-            <w:proofErr w:type="gramStart"/>
             <w:r>
               <w:rPr>
                 <w:rFonts w:ascii="Calibri" w:eastAsia="Calibri" w:hAnsi="Calibri" w:cs="Calibri"/>
               </w:rPr>
               <w:t>services[].status</w:t>
             </w:r>
-            <w:proofErr w:type="gramEnd"/>
           </w:p>
         </w:tc>
         <w:tc>
@@ -1916,12 +1651,6 @@
         </w:tc>
       </w:tr>
       <w:tr>
-        <w:tblPrEx>
-          <w:tblCellMar>
-            <w:top w:w="0" w:type="dxa"/>
-            <w:bottom w:w="0" w:type="dxa"/>
-          </w:tblCellMar>
-        </w:tblPrEx>
         <w:tc>
           <w:tcPr>
             <w:tcW w:w="1100" w:type="pct"/>
@@ -1940,28 +1669,12 @@
             <w:vAlign w:val="center"/>
           </w:tcPr>
           <w:p>
-            <w:proofErr w:type="gramStart"/>
-            <w:r>
-              <w:rPr>
-                <w:rFonts w:ascii="Calibri" w:eastAsia="Calibri" w:hAnsi="Calibri" w:cs="Calibri"/>
-              </w:rPr>
-              <w:t>services[].</w:t>
-            </w:r>
-            <w:proofErr w:type="spellStart"/>
-            <w:r>
-              <w:rPr>
-                <w:rFonts w:ascii="Calibri" w:eastAsia="Calibri" w:hAnsi="Calibri" w:cs="Calibri"/>
-              </w:rPr>
-              <w:t>last</w:t>
-            </w:r>
-            <w:proofErr w:type="gramEnd"/>
-            <w:r>
-              <w:rPr>
-                <w:rFonts w:ascii="Calibri" w:eastAsia="Calibri" w:hAnsi="Calibri" w:cs="Calibri"/>
-              </w:rPr>
-              <w:t>_updated</w:t>
-            </w:r>
-            <w:proofErr w:type="spellEnd"/>
+            <w:r>
+              <w:rPr>
+                <w:rFonts w:ascii="Calibri" w:eastAsia="Calibri" w:hAnsi="Calibri" w:cs="Calibri"/>
+              </w:rPr>
+              <w:t>services[].last_updated</w:t>
+            </w:r>
           </w:p>
         </w:tc>
         <w:tc>
@@ -2044,12 +1757,6 @@
         </w:tc>
       </w:tr>
       <w:tr>
-        <w:tblPrEx>
-          <w:tblCellMar>
-            <w:top w:w="0" w:type="dxa"/>
-            <w:bottom w:w="0" w:type="dxa"/>
-          </w:tblCellMar>
-        </w:tblPrEx>
         <w:tc>
           <w:tcPr>
             <w:tcW w:w="1100" w:type="pct"/>
@@ -2069,14 +1776,12 @@
             <w:vAlign w:val="center"/>
           </w:tcPr>
           <w:p>
-            <w:proofErr w:type="gramStart"/>
             <w:r>
               <w:rPr>
                 <w:rFonts w:ascii="Calibri" w:eastAsia="Calibri" w:hAnsi="Calibri" w:cs="Calibri"/>
               </w:rPr>
               <w:t>services[].message</w:t>
             </w:r>
-            <w:proofErr w:type="gramEnd"/>
           </w:p>
         </w:tc>
         <w:tc>
@@ -2202,12 +1907,6 @@
         <w:gridCol w:w="9696"/>
       </w:tblGrid>
       <w:tr>
-        <w:tblPrEx>
-          <w:tblCellMar>
-            <w:top w:w="0" w:type="dxa"/>
-            <w:bottom w:w="0" w:type="dxa"/>
-          </w:tblCellMar>
-        </w:tblPrEx>
         <w:tc>
           <w:tcPr>
             <w:tcW w:w="5000" w:type="pct"/>
@@ -2242,35 +1941,37 @@
                 <w:sz w:val="18"/>
                 <w:szCs w:val="18"/>
               </w:rPr>
-              <w:t xml:space="preserve">  "</w:t>
-            </w:r>
-            <w:proofErr w:type="spellStart"/>
-            <w:proofErr w:type="gramStart"/>
+              <w:t xml:space="preserve">  "status_code": "OK",</w:t>
+            </w:r>
+          </w:p>
+          <w:p>
             <w:r>
               <w:rPr>
                 <w:rFonts w:ascii="Consolas" w:eastAsia="Consolas" w:hAnsi="Consolas" w:cs="Consolas"/>
                 <w:sz w:val="18"/>
                 <w:szCs w:val="18"/>
               </w:rPr>
-              <w:t>status</w:t>
-            </w:r>
-            <w:proofErr w:type="gramEnd"/>
+              <w:t xml:space="preserve">  "services": [</w:t>
+            </w:r>
+          </w:p>
+          <w:p>
             <w:r>
               <w:rPr>
                 <w:rFonts w:ascii="Consolas" w:eastAsia="Consolas" w:hAnsi="Consolas" w:cs="Consolas"/>
                 <w:sz w:val="18"/>
                 <w:szCs w:val="18"/>
               </w:rPr>
-              <w:t>_code</w:t>
-            </w:r>
-            <w:proofErr w:type="spellEnd"/>
+              <w:t xml:space="preserve">    {</w:t>
+            </w:r>
+          </w:p>
+          <w:p>
             <w:r>
               <w:rPr>
                 <w:rFonts w:ascii="Consolas" w:eastAsia="Consolas" w:hAnsi="Consolas" w:cs="Consolas"/>
                 <w:sz w:val="18"/>
                 <w:szCs w:val="18"/>
               </w:rPr>
-              <w:t>": "OK",</w:t>
+              <w:t xml:space="preserve">      "service_name": "mobile_banking",</w:t>
             </w:r>
           </w:p>
           <w:p>
@@ -2280,7 +1981,7 @@
                 <w:sz w:val="18"/>
                 <w:szCs w:val="18"/>
               </w:rPr>
-              <w:t xml:space="preserve">  "services": [</w:t>
+              <w:t xml:space="preserve">      "status": "degraded",</w:t>
             </w:r>
           </w:p>
           <w:p>
@@ -2290,111 +1991,7 @@
                 <w:sz w:val="18"/>
                 <w:szCs w:val="18"/>
               </w:rPr>
-              <w:t xml:space="preserve">    {</w:t>
-            </w:r>
-          </w:p>
-          <w:p>
-            <w:r>
-              <w:rPr>
-                <w:rFonts w:ascii="Consolas" w:eastAsia="Consolas" w:hAnsi="Consolas" w:cs="Consolas"/>
-                <w:sz w:val="18"/>
-                <w:szCs w:val="18"/>
-              </w:rPr>
-              <w:t xml:space="preserve">      "</w:t>
-            </w:r>
-            <w:proofErr w:type="spellStart"/>
-            <w:proofErr w:type="gramStart"/>
-            <w:r>
-              <w:rPr>
-                <w:rFonts w:ascii="Consolas" w:eastAsia="Consolas" w:hAnsi="Consolas" w:cs="Consolas"/>
-                <w:sz w:val="18"/>
-                <w:szCs w:val="18"/>
-              </w:rPr>
-              <w:t>service</w:t>
-            </w:r>
-            <w:proofErr w:type="gramEnd"/>
-            <w:r>
-              <w:rPr>
-                <w:rFonts w:ascii="Consolas" w:eastAsia="Consolas" w:hAnsi="Consolas" w:cs="Consolas"/>
-                <w:sz w:val="18"/>
-                <w:szCs w:val="18"/>
-              </w:rPr>
-              <w:t>_name</w:t>
-            </w:r>
-            <w:proofErr w:type="spellEnd"/>
-            <w:r>
-              <w:rPr>
-                <w:rFonts w:ascii="Consolas" w:eastAsia="Consolas" w:hAnsi="Consolas" w:cs="Consolas"/>
-                <w:sz w:val="18"/>
-                <w:szCs w:val="18"/>
-              </w:rPr>
-              <w:t>": "</w:t>
-            </w:r>
-            <w:proofErr w:type="spellStart"/>
-            <w:r>
-              <w:rPr>
-                <w:rFonts w:ascii="Consolas" w:eastAsia="Consolas" w:hAnsi="Consolas" w:cs="Consolas"/>
-                <w:sz w:val="18"/>
-                <w:szCs w:val="18"/>
-              </w:rPr>
-              <w:t>mobile_banking</w:t>
-            </w:r>
-            <w:proofErr w:type="spellEnd"/>
-            <w:r>
-              <w:rPr>
-                <w:rFonts w:ascii="Consolas" w:eastAsia="Consolas" w:hAnsi="Consolas" w:cs="Consolas"/>
-                <w:sz w:val="18"/>
-                <w:szCs w:val="18"/>
-              </w:rPr>
-              <w:t>",</w:t>
-            </w:r>
-          </w:p>
-          <w:p>
-            <w:r>
-              <w:rPr>
-                <w:rFonts w:ascii="Consolas" w:eastAsia="Consolas" w:hAnsi="Consolas" w:cs="Consolas"/>
-                <w:sz w:val="18"/>
-                <w:szCs w:val="18"/>
-              </w:rPr>
-              <w:t xml:space="preserve">      "status": "degraded",</w:t>
-            </w:r>
-          </w:p>
-          <w:p>
-            <w:r>
-              <w:rPr>
-                <w:rFonts w:ascii="Consolas" w:eastAsia="Consolas" w:hAnsi="Consolas" w:cs="Consolas"/>
-                <w:sz w:val="18"/>
-                <w:szCs w:val="18"/>
-              </w:rPr>
-              <w:t xml:space="preserve">      "</w:t>
-            </w:r>
-            <w:proofErr w:type="spellStart"/>
-            <w:proofErr w:type="gramStart"/>
-            <w:r>
-              <w:rPr>
-                <w:rFonts w:ascii="Consolas" w:eastAsia="Consolas" w:hAnsi="Consolas" w:cs="Consolas"/>
-                <w:sz w:val="18"/>
-                <w:szCs w:val="18"/>
-              </w:rPr>
-              <w:t>last</w:t>
-            </w:r>
-            <w:proofErr w:type="gramEnd"/>
-            <w:r>
-              <w:rPr>
-                <w:rFonts w:ascii="Consolas" w:eastAsia="Consolas" w:hAnsi="Consolas" w:cs="Consolas"/>
-                <w:sz w:val="18"/>
-                <w:szCs w:val="18"/>
-              </w:rPr>
-              <w:t>_updated</w:t>
-            </w:r>
-            <w:proofErr w:type="spellEnd"/>
-            <w:r>
-              <w:rPr>
-                <w:rFonts w:ascii="Consolas" w:eastAsia="Consolas" w:hAnsi="Consolas" w:cs="Consolas"/>
-                <w:sz w:val="18"/>
-                <w:szCs w:val="18"/>
-              </w:rPr>
-              <w:t>": "2026-09-22T08:15:00Z",</w:t>
+              <w:t xml:space="preserve">      "last_updated": "2026-09-22T08:15:00Z",</w:t>
             </w:r>
           </w:p>
           <w:p>
@@ -2500,18 +2097,8 @@
           <w:bCs/>
         </w:rPr>
         <w:lastRenderedPageBreak/>
-        <w:t xml:space="preserve">Failure </w:t>
+        <w:t>Failure Behaviour</w:t>
       </w:r>
-      <w:proofErr w:type="spellStart"/>
-      <w:r>
-        <w:rPr>
-          <w:rFonts w:ascii="Calibri" w:eastAsia="Calibri" w:hAnsi="Calibri" w:cs="Calibri"/>
-          <w:b/>
-          <w:bCs/>
-        </w:rPr>
-        <w:t>Behaviour</w:t>
-      </w:r>
-      <w:proofErr w:type="spellEnd"/>
     </w:p>
     <w:tbl>
       <w:tblPr>
@@ -2536,12 +2123,6 @@
         <w:gridCol w:w="5035"/>
       </w:tblGrid>
       <w:tr>
-        <w:tblPrEx>
-          <w:tblCellMar>
-            <w:top w:w="0" w:type="dxa"/>
-            <w:bottom w:w="0" w:type="dxa"/>
-          </w:tblCellMar>
-        </w:tblPrEx>
         <w:trPr>
           <w:tblHeader/>
         </w:trPr>
@@ -2631,29 +2212,12 @@
                 <w:bCs/>
                 <w:color w:val="FFFFFF"/>
               </w:rPr>
-              <w:t xml:space="preserve">Agent </w:t>
-            </w:r>
-            <w:proofErr w:type="spellStart"/>
-            <w:r>
-              <w:rPr>
-                <w:rFonts w:ascii="Calibri" w:eastAsia="Calibri" w:hAnsi="Calibri" w:cs="Calibri"/>
-                <w:b/>
-                <w:bCs/>
-                <w:color w:val="FFFFFF"/>
-              </w:rPr>
-              <w:t>behaviour</w:t>
-            </w:r>
-            <w:proofErr w:type="spellEnd"/>
+              <w:t>Agent behaviour</w:t>
+            </w:r>
           </w:p>
         </w:tc>
       </w:tr>
       <w:tr>
-        <w:tblPrEx>
-          <w:tblCellMar>
-            <w:top w:w="0" w:type="dxa"/>
-            <w:bottom w:w="0" w:type="dxa"/>
-          </w:tblCellMar>
-        </w:tblPrEx>
         <w:tc>
           <w:tcPr>
             <w:tcW w:w="1100" w:type="pct"/>
@@ -2702,21 +2266,7 @@
               <w:rPr>
                 <w:rFonts w:ascii="Calibri" w:eastAsia="Calibri" w:hAnsi="Calibri" w:cs="Calibri"/>
               </w:rPr>
-              <w:t xml:space="preserve">N/A — </w:t>
-            </w:r>
-            <w:proofErr w:type="spellStart"/>
-            <w:r>
-              <w:rPr>
-                <w:rFonts w:ascii="Calibri" w:eastAsia="Calibri" w:hAnsi="Calibri" w:cs="Calibri"/>
-              </w:rPr>
-              <w:t>service_name</w:t>
-            </w:r>
-            <w:proofErr w:type="spellEnd"/>
-            <w:r>
-              <w:rPr>
-                <w:rFonts w:ascii="Calibri" w:eastAsia="Calibri" w:hAnsi="Calibri" w:cs="Calibri"/>
-              </w:rPr>
-              <w:t xml:space="preserve"> is optional</w:t>
+              <w:t>N/A — service_name is optional</w:t>
             </w:r>
           </w:p>
         </w:tc>
@@ -2748,12 +2298,6 @@
         </w:tc>
       </w:tr>
       <w:tr>
-        <w:tblPrEx>
-          <w:tblCellMar>
-            <w:top w:w="0" w:type="dxa"/>
-            <w:bottom w:w="0" w:type="dxa"/>
-          </w:tblCellMar>
-        </w:tblPrEx>
         <w:tc>
           <w:tcPr>
             <w:tcW w:w="1100" w:type="pct"/>
@@ -2777,21 +2321,7 @@
               <w:rPr>
                 <w:rFonts w:ascii="Calibri" w:eastAsia="Calibri" w:hAnsi="Calibri" w:cs="Calibri"/>
               </w:rPr>
-              <w:t xml:space="preserve">Invalid </w:t>
-            </w:r>
-            <w:proofErr w:type="spellStart"/>
-            <w:r>
-              <w:rPr>
-                <w:rFonts w:ascii="Calibri" w:eastAsia="Calibri" w:hAnsi="Calibri" w:cs="Calibri"/>
-              </w:rPr>
-              <w:t>service_name</w:t>
-            </w:r>
-            <w:proofErr w:type="spellEnd"/>
-            <w:r>
-              <w:rPr>
-                <w:rFonts w:ascii="Calibri" w:eastAsia="Calibri" w:hAnsi="Calibri" w:cs="Calibri"/>
-              </w:rPr>
-              <w:t xml:space="preserve"> value</w:t>
+              <w:t>Invalid service_name value</w:t>
             </w:r>
           </w:p>
         </w:tc>
@@ -2851,12 +2381,6 @@
         </w:tc>
       </w:tr>
       <w:tr>
-        <w:tblPrEx>
-          <w:tblCellMar>
-            <w:top w:w="0" w:type="dxa"/>
-            <w:bottom w:w="0" w:type="dxa"/>
-          </w:tblCellMar>
-        </w:tblPrEx>
         <w:tc>
           <w:tcPr>
             <w:tcW w:w="1100" w:type="pct"/>
@@ -2937,12 +2461,6 @@
         </w:tc>
       </w:tr>
       <w:tr>
-        <w:tblPrEx>
-          <w:tblCellMar>
-            <w:top w:w="0" w:type="dxa"/>
-            <w:bottom w:w="0" w:type="dxa"/>
-          </w:tblCellMar>
-        </w:tblPrEx>
         <w:tc>
           <w:tcPr>
             <w:tcW w:w="1100" w:type="pct"/>
@@ -3026,12 +2544,6 @@
         </w:tc>
       </w:tr>
       <w:tr>
-        <w:tblPrEx>
-          <w:tblCellMar>
-            <w:top w:w="0" w:type="dxa"/>
-            <w:bottom w:w="0" w:type="dxa"/>
-          </w:tblCellMar>
-        </w:tblPrEx>
         <w:tc>
           <w:tcPr>
             <w:tcW w:w="1100" w:type="pct"/>
@@ -3129,19 +2641,8 @@
           <w:bCs/>
           <w:color w:val="1F3864"/>
         </w:rPr>
-        <w:t xml:space="preserve">Tool 2: </w:t>
+        <w:t>Tool 2: get_ticket_status</w:t>
       </w:r>
-      <w:proofErr w:type="spellStart"/>
-      <w:r>
-        <w:rPr>
-          <w:rFonts w:ascii="Calibri" w:eastAsia="Calibri" w:hAnsi="Calibri" w:cs="Calibri"/>
-          <w:b/>
-          <w:bCs/>
-          <w:color w:val="1F3864"/>
-        </w:rPr>
-        <w:t>get_ticket_status</w:t>
-      </w:r>
-      <w:proofErr w:type="spellEnd"/>
     </w:p>
     <w:p>
       <w:pPr>
@@ -3209,12 +2710,6 @@
         <w:gridCol w:w="2327"/>
       </w:tblGrid>
       <w:tr>
-        <w:tblPrEx>
-          <w:tblCellMar>
-            <w:top w:w="0" w:type="dxa"/>
-            <w:bottom w:w="0" w:type="dxa"/>
-          </w:tblCellMar>
-        </w:tblPrEx>
         <w:trPr>
           <w:tblHeader/>
         </w:trPr>
@@ -3370,12 +2865,6 @@
         </w:tc>
       </w:tr>
       <w:tr>
-        <w:tblPrEx>
-          <w:tblCellMar>
-            <w:top w:w="0" w:type="dxa"/>
-            <w:bottom w:w="0" w:type="dxa"/>
-          </w:tblCellMar>
-        </w:tblPrEx>
         <w:tc>
           <w:tcPr>
             <w:tcW w:w="800" w:type="pct"/>
@@ -3394,14 +2883,12 @@
             <w:vAlign w:val="center"/>
           </w:tcPr>
           <w:p>
-            <w:proofErr w:type="spellStart"/>
             <w:r>
               <w:rPr>
                 <w:rFonts w:ascii="Calibri" w:eastAsia="Calibri" w:hAnsi="Calibri" w:cs="Calibri"/>
               </w:rPr>
               <w:t>ticket_id</w:t>
             </w:r>
-            <w:proofErr w:type="spellEnd"/>
           </w:p>
         </w:tc>
         <w:tc>
@@ -3510,12 +2997,6 @@
         </w:tc>
       </w:tr>
       <w:tr>
-        <w:tblPrEx>
-          <w:tblCellMar>
-            <w:top w:w="0" w:type="dxa"/>
-            <w:bottom w:w="0" w:type="dxa"/>
-          </w:tblCellMar>
-        </w:tblPrEx>
         <w:tc>
           <w:tcPr>
             <w:tcW w:w="800" w:type="pct"/>
@@ -3535,14 +3016,12 @@
             <w:vAlign w:val="center"/>
           </w:tcPr>
           <w:p>
-            <w:proofErr w:type="spellStart"/>
             <w:r>
               <w:rPr>
                 <w:rFonts w:ascii="Calibri" w:eastAsia="Calibri" w:hAnsi="Calibri" w:cs="Calibri"/>
               </w:rPr>
               <w:t>customer_id</w:t>
             </w:r>
-            <w:proofErr w:type="spellEnd"/>
           </w:p>
         </w:tc>
         <w:tc>
@@ -3695,12 +3174,6 @@
         <w:gridCol w:w="9696"/>
       </w:tblGrid>
       <w:tr>
-        <w:tblPrEx>
-          <w:tblCellMar>
-            <w:top w:w="0" w:type="dxa"/>
-            <w:bottom w:w="0" w:type="dxa"/>
-          </w:tblCellMar>
-        </w:tblPrEx>
         <w:tc>
           <w:tcPr>
             <w:tcW w:w="5000" w:type="pct"/>
@@ -3735,73 +3208,17 @@
                 <w:sz w:val="18"/>
                 <w:szCs w:val="18"/>
               </w:rPr>
-              <w:t xml:space="preserve">  "</w:t>
-            </w:r>
-            <w:proofErr w:type="spellStart"/>
-            <w:proofErr w:type="gramStart"/>
+              <w:t xml:space="preserve">  "ticket_id": "CS-10245",</w:t>
+            </w:r>
+          </w:p>
+          <w:p>
             <w:r>
               <w:rPr>
                 <w:rFonts w:ascii="Consolas" w:eastAsia="Consolas" w:hAnsi="Consolas" w:cs="Consolas"/>
                 <w:sz w:val="18"/>
                 <w:szCs w:val="18"/>
               </w:rPr>
-              <w:t>ticket</w:t>
-            </w:r>
-            <w:proofErr w:type="gramEnd"/>
-            <w:r>
-              <w:rPr>
-                <w:rFonts w:ascii="Consolas" w:eastAsia="Consolas" w:hAnsi="Consolas" w:cs="Consolas"/>
-                <w:sz w:val="18"/>
-                <w:szCs w:val="18"/>
-              </w:rPr>
-              <w:t>_id</w:t>
-            </w:r>
-            <w:proofErr w:type="spellEnd"/>
-            <w:r>
-              <w:rPr>
-                <w:rFonts w:ascii="Consolas" w:eastAsia="Consolas" w:hAnsi="Consolas" w:cs="Consolas"/>
-                <w:sz w:val="18"/>
-                <w:szCs w:val="18"/>
-              </w:rPr>
-              <w:t>": "CS-10245",</w:t>
-            </w:r>
-          </w:p>
-          <w:p>
-            <w:r>
-              <w:rPr>
-                <w:rFonts w:ascii="Consolas" w:eastAsia="Consolas" w:hAnsi="Consolas" w:cs="Consolas"/>
-                <w:sz w:val="18"/>
-                <w:szCs w:val="18"/>
-              </w:rPr>
-              <w:t xml:space="preserve">  "</w:t>
-            </w:r>
-            <w:proofErr w:type="spellStart"/>
-            <w:proofErr w:type="gramStart"/>
-            <w:r>
-              <w:rPr>
-                <w:rFonts w:ascii="Consolas" w:eastAsia="Consolas" w:hAnsi="Consolas" w:cs="Consolas"/>
-                <w:sz w:val="18"/>
-                <w:szCs w:val="18"/>
-              </w:rPr>
-              <w:t>customer</w:t>
-            </w:r>
-            <w:proofErr w:type="gramEnd"/>
-            <w:r>
-              <w:rPr>
-                <w:rFonts w:ascii="Consolas" w:eastAsia="Consolas" w:hAnsi="Consolas" w:cs="Consolas"/>
-                <w:sz w:val="18"/>
-                <w:szCs w:val="18"/>
-              </w:rPr>
-              <w:t>_id</w:t>
-            </w:r>
-            <w:proofErr w:type="spellEnd"/>
-            <w:r>
-              <w:rPr>
-                <w:rFonts w:ascii="Consolas" w:eastAsia="Consolas" w:hAnsi="Consolas" w:cs="Consolas"/>
-                <w:sz w:val="18"/>
-                <w:szCs w:val="18"/>
-              </w:rPr>
-              <w:t>": "CUST-88213"</w:t>
+              <w:t xml:space="preserve">  "customer_id": "CUST-88213"</w:t>
             </w:r>
           </w:p>
           <w:p>
@@ -3860,12 +3277,6 @@
         <w:gridCol w:w="2521"/>
       </w:tblGrid>
       <w:tr>
-        <w:tblPrEx>
-          <w:tblCellMar>
-            <w:top w:w="0" w:type="dxa"/>
-            <w:bottom w:w="0" w:type="dxa"/>
-          </w:tblCellMar>
-        </w:tblPrEx>
         <w:trPr>
           <w:tblHeader/>
         </w:trPr>
@@ -3991,12 +3402,6 @@
         </w:tc>
       </w:tr>
       <w:tr>
-        <w:tblPrEx>
-          <w:tblCellMar>
-            <w:top w:w="0" w:type="dxa"/>
-            <w:bottom w:w="0" w:type="dxa"/>
-          </w:tblCellMar>
-        </w:tblPrEx>
         <w:tc>
           <w:tcPr>
             <w:tcW w:w="1100" w:type="pct"/>
@@ -4015,14 +3420,12 @@
             <w:vAlign w:val="center"/>
           </w:tcPr>
           <w:p>
-            <w:proofErr w:type="spellStart"/>
             <w:r>
               <w:rPr>
                 <w:rFonts w:ascii="Calibri" w:eastAsia="Calibri" w:hAnsi="Calibri" w:cs="Calibri"/>
               </w:rPr>
               <w:t>status_code</w:t>
             </w:r>
-            <w:proofErr w:type="spellEnd"/>
           </w:p>
         </w:tc>
         <w:tc>
@@ -4105,12 +3508,6 @@
         </w:tc>
       </w:tr>
       <w:tr>
-        <w:tblPrEx>
-          <w:tblCellMar>
-            <w:top w:w="0" w:type="dxa"/>
-            <w:bottom w:w="0" w:type="dxa"/>
-          </w:tblCellMar>
-        </w:tblPrEx>
         <w:tc>
           <w:tcPr>
             <w:tcW w:w="1100" w:type="pct"/>
@@ -4130,14 +3527,12 @@
             <w:vAlign w:val="center"/>
           </w:tcPr>
           <w:p>
-            <w:proofErr w:type="spellStart"/>
             <w:r>
               <w:rPr>
                 <w:rFonts w:ascii="Calibri" w:eastAsia="Calibri" w:hAnsi="Calibri" w:cs="Calibri"/>
               </w:rPr>
               <w:t>ticket_id</w:t>
             </w:r>
-            <w:proofErr w:type="spellEnd"/>
           </w:p>
         </w:tc>
         <w:tc>
@@ -4223,12 +3618,6 @@
         </w:tc>
       </w:tr>
       <w:tr>
-        <w:tblPrEx>
-          <w:tblCellMar>
-            <w:top w:w="0" w:type="dxa"/>
-            <w:bottom w:w="0" w:type="dxa"/>
-          </w:tblCellMar>
-        </w:tblPrEx>
         <w:tc>
           <w:tcPr>
             <w:tcW w:w="1100" w:type="pct"/>
@@ -4329,32 +3718,12 @@
               <w:rPr>
                 <w:rFonts w:ascii="Calibri" w:eastAsia="Calibri" w:hAnsi="Calibri" w:cs="Calibri"/>
               </w:rPr>
-              <w:t xml:space="preserve">open, </w:t>
-            </w:r>
-            <w:proofErr w:type="spellStart"/>
-            <w:r>
-              <w:rPr>
-                <w:rFonts w:ascii="Calibri" w:eastAsia="Calibri" w:hAnsi="Calibri" w:cs="Calibri"/>
-              </w:rPr>
-              <w:t>in_progress</w:t>
-            </w:r>
-            <w:proofErr w:type="spellEnd"/>
-            <w:r>
-              <w:rPr>
-                <w:rFonts w:ascii="Calibri" w:eastAsia="Calibri" w:hAnsi="Calibri" w:cs="Calibri"/>
-              </w:rPr>
-              <w:t>, resolved, closed, escalated</w:t>
+              <w:t>open, in_progress, resolved, closed, escalated</w:t>
             </w:r>
           </w:p>
         </w:tc>
       </w:tr>
       <w:tr>
-        <w:tblPrEx>
-          <w:tblCellMar>
-            <w:top w:w="0" w:type="dxa"/>
-            <w:bottom w:w="0" w:type="dxa"/>
-          </w:tblCellMar>
-        </w:tblPrEx>
         <w:tc>
           <w:tcPr>
             <w:tcW w:w="1100" w:type="pct"/>
@@ -4459,54 +3828,12 @@
               <w:rPr>
                 <w:rFonts w:ascii="Calibri" w:eastAsia="Calibri" w:hAnsi="Calibri" w:cs="Calibri"/>
               </w:rPr>
-              <w:t xml:space="preserve">e.g. </w:t>
-            </w:r>
-            <w:proofErr w:type="spellStart"/>
-            <w:r>
-              <w:rPr>
-                <w:rFonts w:ascii="Calibri" w:eastAsia="Calibri" w:hAnsi="Calibri" w:cs="Calibri"/>
-              </w:rPr>
-              <w:t>mobile_banking</w:t>
-            </w:r>
-            <w:proofErr w:type="spellEnd"/>
-            <w:r>
-              <w:rPr>
-                <w:rFonts w:ascii="Calibri" w:eastAsia="Calibri" w:hAnsi="Calibri" w:cs="Calibri"/>
-              </w:rPr>
-              <w:t xml:space="preserve">, </w:t>
-            </w:r>
-            <w:proofErr w:type="spellStart"/>
-            <w:r>
-              <w:rPr>
-                <w:rFonts w:ascii="Calibri" w:eastAsia="Calibri" w:hAnsi="Calibri" w:cs="Calibri"/>
-              </w:rPr>
-              <w:t>card_services</w:t>
-            </w:r>
-            <w:proofErr w:type="spellEnd"/>
-            <w:r>
-              <w:rPr>
-                <w:rFonts w:ascii="Calibri" w:eastAsia="Calibri" w:hAnsi="Calibri" w:cs="Calibri"/>
-              </w:rPr>
-              <w:t xml:space="preserve">, </w:t>
-            </w:r>
-            <w:proofErr w:type="spellStart"/>
-            <w:r>
-              <w:rPr>
-                <w:rFonts w:ascii="Calibri" w:eastAsia="Calibri" w:hAnsi="Calibri" w:cs="Calibri"/>
-              </w:rPr>
-              <w:t>account_access</w:t>
-            </w:r>
-            <w:proofErr w:type="spellEnd"/>
+              <w:t>e.g. mobile_banking, card_services, account_access</w:t>
+            </w:r>
           </w:p>
         </w:tc>
       </w:tr>
       <w:tr>
-        <w:tblPrEx>
-          <w:tblCellMar>
-            <w:top w:w="0" w:type="dxa"/>
-            <w:bottom w:w="0" w:type="dxa"/>
-          </w:tblCellMar>
-        </w:tblPrEx>
         <w:tc>
           <w:tcPr>
             <w:tcW w:w="1100" w:type="pct"/>
@@ -4525,14 +3852,12 @@
             <w:vAlign w:val="center"/>
           </w:tcPr>
           <w:p>
-            <w:proofErr w:type="spellStart"/>
             <w:r>
               <w:rPr>
                 <w:rFonts w:ascii="Calibri" w:eastAsia="Calibri" w:hAnsi="Calibri" w:cs="Calibri"/>
               </w:rPr>
               <w:t>created_at</w:t>
             </w:r>
-            <w:proofErr w:type="spellEnd"/>
           </w:p>
         </w:tc>
         <w:tc>
@@ -4615,12 +3940,6 @@
         </w:tc>
       </w:tr>
       <w:tr>
-        <w:tblPrEx>
-          <w:tblCellMar>
-            <w:top w:w="0" w:type="dxa"/>
-            <w:bottom w:w="0" w:type="dxa"/>
-          </w:tblCellMar>
-        </w:tblPrEx>
         <w:tc>
           <w:tcPr>
             <w:tcW w:w="1100" w:type="pct"/>
@@ -4640,7 +3959,6 @@
             <w:vAlign w:val="center"/>
           </w:tcPr>
           <w:p>
-            <w:proofErr w:type="spellStart"/>
             <w:r>
               <w:rPr>
                 <w:rFonts w:ascii="Calibri" w:eastAsia="Calibri" w:hAnsi="Calibri" w:cs="Calibri"/>
@@ -4648,7 +3966,6 @@
               <w:lastRenderedPageBreak/>
               <w:t>last_updated</w:t>
             </w:r>
-            <w:proofErr w:type="spellEnd"/>
           </w:p>
         </w:tc>
         <w:tc>
@@ -4734,12 +4051,6 @@
         </w:tc>
       </w:tr>
       <w:tr>
-        <w:tblPrEx>
-          <w:tblCellMar>
-            <w:top w:w="0" w:type="dxa"/>
-            <w:bottom w:w="0" w:type="dxa"/>
-          </w:tblCellMar>
-        </w:tblPrEx>
         <w:tc>
           <w:tcPr>
             <w:tcW w:w="1100" w:type="pct"/>
@@ -4886,12 +4197,6 @@
         <w:gridCol w:w="9696"/>
       </w:tblGrid>
       <w:tr>
-        <w:tblPrEx>
-          <w:tblCellMar>
-            <w:top w:w="0" w:type="dxa"/>
-            <w:bottom w:w="0" w:type="dxa"/>
-          </w:tblCellMar>
-        </w:tblPrEx>
         <w:tc>
           <w:tcPr>
             <w:tcW w:w="5000" w:type="pct"/>
@@ -4926,35 +4231,37 @@
                 <w:sz w:val="18"/>
                 <w:szCs w:val="18"/>
               </w:rPr>
-              <w:t xml:space="preserve">  "</w:t>
-            </w:r>
-            <w:proofErr w:type="spellStart"/>
-            <w:proofErr w:type="gramStart"/>
+              <w:t xml:space="preserve">  "status_code": "OK",</w:t>
+            </w:r>
+          </w:p>
+          <w:p>
             <w:r>
               <w:rPr>
                 <w:rFonts w:ascii="Consolas" w:eastAsia="Consolas" w:hAnsi="Consolas" w:cs="Consolas"/>
                 <w:sz w:val="18"/>
                 <w:szCs w:val="18"/>
               </w:rPr>
-              <w:t>status</w:t>
-            </w:r>
-            <w:proofErr w:type="gramEnd"/>
+              <w:t xml:space="preserve">  "ticket_id": "CS-10245",</w:t>
+            </w:r>
+          </w:p>
+          <w:p>
             <w:r>
               <w:rPr>
                 <w:rFonts w:ascii="Consolas" w:eastAsia="Consolas" w:hAnsi="Consolas" w:cs="Consolas"/>
                 <w:sz w:val="18"/>
                 <w:szCs w:val="18"/>
               </w:rPr>
-              <w:t>_code</w:t>
-            </w:r>
-            <w:proofErr w:type="spellEnd"/>
+              <w:t xml:space="preserve">  "status": "in_progress",</w:t>
+            </w:r>
+          </w:p>
+          <w:p>
             <w:r>
               <w:rPr>
                 <w:rFonts w:ascii="Consolas" w:eastAsia="Consolas" w:hAnsi="Consolas" w:cs="Consolas"/>
                 <w:sz w:val="18"/>
                 <w:szCs w:val="18"/>
               </w:rPr>
-              <w:t>": "OK",</w:t>
+              <w:t xml:space="preserve">  "category": "mobile_banking",</w:t>
             </w:r>
           </w:p>
           <w:p>
@@ -4964,167 +4271,17 @@
                 <w:sz w:val="18"/>
                 <w:szCs w:val="18"/>
               </w:rPr>
-              <w:t xml:space="preserve">  "</w:t>
-            </w:r>
-            <w:proofErr w:type="spellStart"/>
-            <w:proofErr w:type="gramStart"/>
+              <w:t xml:space="preserve">  "created_at": "2026-09-20T10:02:00Z",</w:t>
+            </w:r>
+          </w:p>
+          <w:p>
             <w:r>
               <w:rPr>
                 <w:rFonts w:ascii="Consolas" w:eastAsia="Consolas" w:hAnsi="Consolas" w:cs="Consolas"/>
                 <w:sz w:val="18"/>
                 <w:szCs w:val="18"/>
               </w:rPr>
-              <w:t>ticket</w:t>
-            </w:r>
-            <w:proofErr w:type="gramEnd"/>
-            <w:r>
-              <w:rPr>
-                <w:rFonts w:ascii="Consolas" w:eastAsia="Consolas" w:hAnsi="Consolas" w:cs="Consolas"/>
-                <w:sz w:val="18"/>
-                <w:szCs w:val="18"/>
-              </w:rPr>
-              <w:t>_id</w:t>
-            </w:r>
-            <w:proofErr w:type="spellEnd"/>
-            <w:r>
-              <w:rPr>
-                <w:rFonts w:ascii="Consolas" w:eastAsia="Consolas" w:hAnsi="Consolas" w:cs="Consolas"/>
-                <w:sz w:val="18"/>
-                <w:szCs w:val="18"/>
-              </w:rPr>
-              <w:t>": "CS-10245",</w:t>
-            </w:r>
-          </w:p>
-          <w:p>
-            <w:r>
-              <w:rPr>
-                <w:rFonts w:ascii="Consolas" w:eastAsia="Consolas" w:hAnsi="Consolas" w:cs="Consolas"/>
-                <w:sz w:val="18"/>
-                <w:szCs w:val="18"/>
-              </w:rPr>
-              <w:t xml:space="preserve">  "status": "</w:t>
-            </w:r>
-            <w:proofErr w:type="spellStart"/>
-            <w:r>
-              <w:rPr>
-                <w:rFonts w:ascii="Consolas" w:eastAsia="Consolas" w:hAnsi="Consolas" w:cs="Consolas"/>
-                <w:sz w:val="18"/>
-                <w:szCs w:val="18"/>
-              </w:rPr>
-              <w:t>in_progress</w:t>
-            </w:r>
-            <w:proofErr w:type="spellEnd"/>
-            <w:r>
-              <w:rPr>
-                <w:rFonts w:ascii="Consolas" w:eastAsia="Consolas" w:hAnsi="Consolas" w:cs="Consolas"/>
-                <w:sz w:val="18"/>
-                <w:szCs w:val="18"/>
-              </w:rPr>
-              <w:t>",</w:t>
-            </w:r>
-          </w:p>
-          <w:p>
-            <w:r>
-              <w:rPr>
-                <w:rFonts w:ascii="Consolas" w:eastAsia="Consolas" w:hAnsi="Consolas" w:cs="Consolas"/>
-                <w:sz w:val="18"/>
-                <w:szCs w:val="18"/>
-              </w:rPr>
-              <w:t xml:space="preserve">  "category": "</w:t>
-            </w:r>
-            <w:proofErr w:type="spellStart"/>
-            <w:r>
-              <w:rPr>
-                <w:rFonts w:ascii="Consolas" w:eastAsia="Consolas" w:hAnsi="Consolas" w:cs="Consolas"/>
-                <w:sz w:val="18"/>
-                <w:szCs w:val="18"/>
-              </w:rPr>
-              <w:t>mobile_banking</w:t>
-            </w:r>
-            <w:proofErr w:type="spellEnd"/>
-            <w:r>
-              <w:rPr>
-                <w:rFonts w:ascii="Consolas" w:eastAsia="Consolas" w:hAnsi="Consolas" w:cs="Consolas"/>
-                <w:sz w:val="18"/>
-                <w:szCs w:val="18"/>
-              </w:rPr>
-              <w:t>",</w:t>
-            </w:r>
-          </w:p>
-          <w:p>
-            <w:r>
-              <w:rPr>
-                <w:rFonts w:ascii="Consolas" w:eastAsia="Consolas" w:hAnsi="Consolas" w:cs="Consolas"/>
-                <w:sz w:val="18"/>
-                <w:szCs w:val="18"/>
-              </w:rPr>
-              <w:t xml:space="preserve">  "</w:t>
-            </w:r>
-            <w:proofErr w:type="spellStart"/>
-            <w:proofErr w:type="gramStart"/>
-            <w:r>
-              <w:rPr>
-                <w:rFonts w:ascii="Consolas" w:eastAsia="Consolas" w:hAnsi="Consolas" w:cs="Consolas"/>
-                <w:sz w:val="18"/>
-                <w:szCs w:val="18"/>
-              </w:rPr>
-              <w:t>created</w:t>
-            </w:r>
-            <w:proofErr w:type="gramEnd"/>
-            <w:r>
-              <w:rPr>
-                <w:rFonts w:ascii="Consolas" w:eastAsia="Consolas" w:hAnsi="Consolas" w:cs="Consolas"/>
-                <w:sz w:val="18"/>
-                <w:szCs w:val="18"/>
-              </w:rPr>
-              <w:t>_at</w:t>
-            </w:r>
-            <w:proofErr w:type="spellEnd"/>
-            <w:r>
-              <w:rPr>
-                <w:rFonts w:ascii="Consolas" w:eastAsia="Consolas" w:hAnsi="Consolas" w:cs="Consolas"/>
-                <w:sz w:val="18"/>
-                <w:szCs w:val="18"/>
-              </w:rPr>
-              <w:t>": "2026-09-20T10:02:00Z",</w:t>
-            </w:r>
-          </w:p>
-          <w:p>
-            <w:r>
-              <w:rPr>
-                <w:rFonts w:ascii="Consolas" w:eastAsia="Consolas" w:hAnsi="Consolas" w:cs="Consolas"/>
-                <w:sz w:val="18"/>
-                <w:szCs w:val="18"/>
-              </w:rPr>
-              <w:t xml:space="preserve">  "</w:t>
-            </w:r>
-            <w:proofErr w:type="spellStart"/>
-            <w:proofErr w:type="gramStart"/>
-            <w:r>
-              <w:rPr>
-                <w:rFonts w:ascii="Consolas" w:eastAsia="Consolas" w:hAnsi="Consolas" w:cs="Consolas"/>
-                <w:sz w:val="18"/>
-                <w:szCs w:val="18"/>
-              </w:rPr>
-              <w:t>last</w:t>
-            </w:r>
-            <w:proofErr w:type="gramEnd"/>
-            <w:r>
-              <w:rPr>
-                <w:rFonts w:ascii="Consolas" w:eastAsia="Consolas" w:hAnsi="Consolas" w:cs="Consolas"/>
-                <w:sz w:val="18"/>
-                <w:szCs w:val="18"/>
-              </w:rPr>
-              <w:t>_updated</w:t>
-            </w:r>
-            <w:proofErr w:type="spellEnd"/>
-            <w:r>
-              <w:rPr>
-                <w:rFonts w:ascii="Consolas" w:eastAsia="Consolas" w:hAnsi="Consolas" w:cs="Consolas"/>
-                <w:sz w:val="18"/>
-                <w:szCs w:val="18"/>
-              </w:rPr>
-              <w:t>": "2026-09-21T14:30:00Z",</w:t>
+              <w:t xml:space="preserve">  "last_updated": "2026-09-21T14:30:00Z",</w:t>
             </w:r>
           </w:p>
           <w:p>
@@ -5179,61 +4336,7 @@
           <w:sz w:val="22"/>
           <w:szCs w:val="22"/>
         </w:rPr>
-        <w:t>Authentication confirms the caller's identity (</w:t>
-      </w:r>
-      <w:proofErr w:type="spellStart"/>
-      <w:r>
-        <w:rPr>
-          <w:rFonts w:ascii="Calibri" w:eastAsia="Calibri" w:hAnsi="Calibri" w:cs="Calibri"/>
-          <w:sz w:val="22"/>
-          <w:szCs w:val="22"/>
-        </w:rPr>
-        <w:t>customer_id</w:t>
-      </w:r>
-      <w:proofErr w:type="spellEnd"/>
-      <w:r>
-        <w:rPr>
-          <w:rFonts w:ascii="Calibri" w:eastAsia="Calibri" w:hAnsi="Calibri" w:cs="Calibri"/>
-          <w:sz w:val="22"/>
-          <w:szCs w:val="22"/>
-        </w:rPr>
-        <w:t xml:space="preserve">). Authorization is the additional, mandatory check performed by the application layer: before returning any data, it must verify that the ticket identified by </w:t>
-      </w:r>
-      <w:proofErr w:type="spellStart"/>
-      <w:r>
-        <w:rPr>
-          <w:rFonts w:ascii="Calibri" w:eastAsia="Calibri" w:hAnsi="Calibri" w:cs="Calibri"/>
-          <w:sz w:val="22"/>
-          <w:szCs w:val="22"/>
-        </w:rPr>
-        <w:t>ticket_id</w:t>
-      </w:r>
-      <w:proofErr w:type="spellEnd"/>
-      <w:r>
-        <w:rPr>
-          <w:rFonts w:ascii="Calibri" w:eastAsia="Calibri" w:hAnsi="Calibri" w:cs="Calibri"/>
-          <w:sz w:val="22"/>
-          <w:szCs w:val="22"/>
-        </w:rPr>
-        <w:t xml:space="preserve"> actually belongs to the requesting </w:t>
-      </w:r>
-      <w:proofErr w:type="spellStart"/>
-      <w:r>
-        <w:rPr>
-          <w:rFonts w:ascii="Calibri" w:eastAsia="Calibri" w:hAnsi="Calibri" w:cs="Calibri"/>
-          <w:sz w:val="22"/>
-          <w:szCs w:val="22"/>
-        </w:rPr>
-        <w:t>customer_id</w:t>
-      </w:r>
-      <w:proofErr w:type="spellEnd"/>
-      <w:r>
-        <w:rPr>
-          <w:rFonts w:ascii="Calibri" w:eastAsia="Calibri" w:hAnsi="Calibri" w:cs="Calibri"/>
-          <w:sz w:val="22"/>
-          <w:szCs w:val="22"/>
-        </w:rPr>
-        <w:t>. If the ticket belongs to a different customer, the request is rejected as UNAUTHORIZED</w:t>
+        <w:t>Authentication confirms the caller's identity (customer_id). Authorization is the additional, mandatory check performed by the application layer: before returning any data, it must verify that the ticket identified by ticket_id actually belongs to the requesting customer_id. If the ticket belongs to a different customer, the request is rejected as UNAUTHORIZED</w:t>
       </w:r>
       <w:r>
         <w:rPr>
@@ -5263,18 +4366,8 @@
           <w:b/>
           <w:bCs/>
         </w:rPr>
-        <w:t xml:space="preserve">Failure </w:t>
+        <w:t>Failure Behaviour</w:t>
       </w:r>
-      <w:proofErr w:type="spellStart"/>
-      <w:r>
-        <w:rPr>
-          <w:rFonts w:ascii="Calibri" w:eastAsia="Calibri" w:hAnsi="Calibri" w:cs="Calibri"/>
-          <w:b/>
-          <w:bCs/>
-        </w:rPr>
-        <w:t>Behaviour</w:t>
-      </w:r>
-      <w:proofErr w:type="spellEnd"/>
     </w:p>
     <w:tbl>
       <w:tblPr>
@@ -5299,12 +4392,6 @@
         <w:gridCol w:w="5035"/>
       </w:tblGrid>
       <w:tr>
-        <w:tblPrEx>
-          <w:tblCellMar>
-            <w:top w:w="0" w:type="dxa"/>
-            <w:bottom w:w="0" w:type="dxa"/>
-          </w:tblCellMar>
-        </w:tblPrEx>
         <w:trPr>
           <w:tblHeader/>
         </w:trPr>
@@ -5394,29 +4481,12 @@
                 <w:bCs/>
                 <w:color w:val="FFFFFF"/>
               </w:rPr>
-              <w:t xml:space="preserve">Agent </w:t>
-            </w:r>
-            <w:proofErr w:type="spellStart"/>
-            <w:r>
-              <w:rPr>
-                <w:rFonts w:ascii="Calibri" w:eastAsia="Calibri" w:hAnsi="Calibri" w:cs="Calibri"/>
-                <w:b/>
-                <w:bCs/>
-                <w:color w:val="FFFFFF"/>
-              </w:rPr>
-              <w:t>behaviour</w:t>
-            </w:r>
-            <w:proofErr w:type="spellEnd"/>
+              <w:t>Agent behaviour</w:t>
+            </w:r>
           </w:p>
         </w:tc>
       </w:tr>
       <w:tr>
-        <w:tblPrEx>
-          <w:tblCellMar>
-            <w:top w:w="0" w:type="dxa"/>
-            <w:bottom w:w="0" w:type="dxa"/>
-          </w:tblCellMar>
-        </w:tblPrEx>
         <w:tc>
           <w:tcPr>
             <w:tcW w:w="1100" w:type="pct"/>
@@ -5439,30 +4509,8 @@
               <w:rPr>
                 <w:rFonts w:ascii="Calibri" w:eastAsia="Calibri" w:hAnsi="Calibri" w:cs="Calibri"/>
               </w:rPr>
-              <w:t xml:space="preserve">Missing </w:t>
-            </w:r>
-            <w:proofErr w:type="spellStart"/>
-            <w:r>
-              <w:rPr>
-                <w:rFonts w:ascii="Calibri" w:eastAsia="Calibri" w:hAnsi="Calibri" w:cs="Calibri"/>
-              </w:rPr>
-              <w:t>ticket_id</w:t>
-            </w:r>
-            <w:proofErr w:type="spellEnd"/>
-            <w:r>
-              <w:rPr>
-                <w:rFonts w:ascii="Calibri" w:eastAsia="Calibri" w:hAnsi="Calibri" w:cs="Calibri"/>
-              </w:rPr>
-              <w:t xml:space="preserve"> or </w:t>
-            </w:r>
-            <w:proofErr w:type="spellStart"/>
-            <w:r>
-              <w:rPr>
-                <w:rFonts w:ascii="Calibri" w:eastAsia="Calibri" w:hAnsi="Calibri" w:cs="Calibri"/>
-              </w:rPr>
-              <w:t>customer_id</w:t>
-            </w:r>
-            <w:proofErr w:type="spellEnd"/>
+              <w:t>Missing ticket_id or customer_id</w:t>
+            </w:r>
           </w:p>
         </w:tc>
         <w:tc>
@@ -5513,32 +4561,12 @@
               <w:rPr>
                 <w:rFonts w:ascii="Calibri" w:eastAsia="Calibri" w:hAnsi="Calibri" w:cs="Calibri"/>
               </w:rPr>
-              <w:t>Asks the customer for the missing ticket number (</w:t>
-            </w:r>
-            <w:proofErr w:type="spellStart"/>
-            <w:r>
-              <w:rPr>
-                <w:rFonts w:ascii="Calibri" w:eastAsia="Calibri" w:hAnsi="Calibri" w:cs="Calibri"/>
-              </w:rPr>
-              <w:t>customer_id</w:t>
-            </w:r>
-            <w:proofErr w:type="spellEnd"/>
-            <w:r>
-              <w:rPr>
-                <w:rFonts w:ascii="Calibri" w:eastAsia="Calibri" w:hAnsi="Calibri" w:cs="Calibri"/>
-              </w:rPr>
-              <w:t xml:space="preserve"> is never requested from the customer directly)</w:t>
+              <w:t>Asks the customer for the missing ticket number (customer_id is never requested from the customer directly)</w:t>
             </w:r>
           </w:p>
         </w:tc>
       </w:tr>
       <w:tr>
-        <w:tblPrEx>
-          <w:tblCellMar>
-            <w:top w:w="0" w:type="dxa"/>
-            <w:bottom w:w="0" w:type="dxa"/>
-          </w:tblCellMar>
-        </w:tblPrEx>
         <w:tc>
           <w:tcPr>
             <w:tcW w:w="1100" w:type="pct"/>
@@ -5558,19 +4586,11 @@
             <w:vAlign w:val="center"/>
           </w:tcPr>
           <w:p>
-            <w:proofErr w:type="spellStart"/>
-            <w:r>
-              <w:rPr>
-                <w:rFonts w:ascii="Calibri" w:eastAsia="Calibri" w:hAnsi="Calibri" w:cs="Calibri"/>
-              </w:rPr>
-              <w:t>ticket_id</w:t>
-            </w:r>
-            <w:proofErr w:type="spellEnd"/>
-            <w:r>
-              <w:rPr>
-                <w:rFonts w:ascii="Calibri" w:eastAsia="Calibri" w:hAnsi="Calibri" w:cs="Calibri"/>
-              </w:rPr>
-              <w:t xml:space="preserve"> not found</w:t>
+            <w:r>
+              <w:rPr>
+                <w:rFonts w:ascii="Calibri" w:eastAsia="Calibri" w:hAnsi="Calibri" w:cs="Calibri"/>
+              </w:rPr>
+              <w:t>ticket_id not found</w:t>
             </w:r>
           </w:p>
         </w:tc>
@@ -5630,12 +4650,6 @@
         </w:tc>
       </w:tr>
       <w:tr>
-        <w:tblPrEx>
-          <w:tblCellMar>
-            <w:top w:w="0" w:type="dxa"/>
-            <w:bottom w:w="0" w:type="dxa"/>
-          </w:tblCellMar>
-        </w:tblPrEx>
         <w:tc>
           <w:tcPr>
             <w:tcW w:w="1100" w:type="pct"/>
@@ -5716,12 +4730,6 @@
         </w:tc>
       </w:tr>
       <w:tr>
-        <w:tblPrEx>
-          <w:tblCellMar>
-            <w:top w:w="0" w:type="dxa"/>
-            <w:bottom w:w="0" w:type="dxa"/>
-          </w:tblCellMar>
-        </w:tblPrEx>
         <w:tc>
           <w:tcPr>
             <w:tcW w:w="1100" w:type="pct"/>
@@ -5805,12 +4813,6 @@
         </w:tc>
       </w:tr>
       <w:tr>
-        <w:tblPrEx>
-          <w:tblCellMar>
-            <w:top w:w="0" w:type="dxa"/>
-            <w:bottom w:w="0" w:type="dxa"/>
-          </w:tblCellMar>
-        </w:tblPrEx>
         <w:tc>
           <w:tcPr>
             <w:tcW w:w="1100" w:type="pct"/>
@@ -5908,19 +4910,8 @@
           <w:bCs/>
           <w:color w:val="1F3864"/>
         </w:rPr>
-        <w:t xml:space="preserve">Tool 3: </w:t>
+        <w:t>Tool 3: create_support_ticket</w:t>
       </w:r>
-      <w:proofErr w:type="spellStart"/>
-      <w:r>
-        <w:rPr>
-          <w:rFonts w:ascii="Calibri" w:eastAsia="Calibri" w:hAnsi="Calibri" w:cs="Calibri"/>
-          <w:b/>
-          <w:bCs/>
-          <w:color w:val="1F3864"/>
-        </w:rPr>
-        <w:t>create_support_ticket</w:t>
-      </w:r>
-      <w:proofErr w:type="spellEnd"/>
     </w:p>
     <w:p>
       <w:pPr>
@@ -5988,12 +4979,6 @@
         <w:gridCol w:w="2285"/>
       </w:tblGrid>
       <w:tr>
-        <w:tblPrEx>
-          <w:tblCellMar>
-            <w:top w:w="0" w:type="dxa"/>
-            <w:bottom w:w="0" w:type="dxa"/>
-          </w:tblCellMar>
-        </w:tblPrEx>
         <w:trPr>
           <w:tblHeader/>
         </w:trPr>
@@ -6150,12 +5135,6 @@
         </w:tc>
       </w:tr>
       <w:tr>
-        <w:tblPrEx>
-          <w:tblCellMar>
-            <w:top w:w="0" w:type="dxa"/>
-            <w:bottom w:w="0" w:type="dxa"/>
-          </w:tblCellMar>
-        </w:tblPrEx>
         <w:tc>
           <w:tcPr>
             <w:tcW w:w="800" w:type="pct"/>
@@ -6174,14 +5153,12 @@
             <w:vAlign w:val="center"/>
           </w:tcPr>
           <w:p>
-            <w:proofErr w:type="spellStart"/>
             <w:r>
               <w:rPr>
                 <w:rFonts w:ascii="Calibri" w:eastAsia="Calibri" w:hAnsi="Calibri" w:cs="Calibri"/>
               </w:rPr>
               <w:t>customer_id</w:t>
             </w:r>
-            <w:proofErr w:type="spellEnd"/>
           </w:p>
         </w:tc>
         <w:tc>
@@ -6290,12 +5267,6 @@
         </w:tc>
       </w:tr>
       <w:tr>
-        <w:tblPrEx>
-          <w:tblCellMar>
-            <w:top w:w="0" w:type="dxa"/>
-            <w:bottom w:w="0" w:type="dxa"/>
-          </w:tblCellMar>
-        </w:tblPrEx>
         <w:tc>
           <w:tcPr>
             <w:tcW w:w="800" w:type="pct"/>
@@ -6423,100 +5394,16 @@
             <w:vAlign w:val="center"/>
           </w:tcPr>
           <w:p>
-            <w:proofErr w:type="spellStart"/>
-            <w:r>
-              <w:rPr>
-                <w:rFonts w:ascii="Calibri" w:eastAsia="Calibri" w:hAnsi="Calibri" w:cs="Calibri"/>
-              </w:rPr>
-              <w:t>mobile_banking</w:t>
-            </w:r>
-            <w:proofErr w:type="spellEnd"/>
-            <w:r>
-              <w:rPr>
-                <w:rFonts w:ascii="Calibri" w:eastAsia="Calibri" w:hAnsi="Calibri" w:cs="Calibri"/>
-              </w:rPr>
-              <w:t xml:space="preserve">, </w:t>
-            </w:r>
-            <w:proofErr w:type="spellStart"/>
-            <w:r>
-              <w:rPr>
-                <w:rFonts w:ascii="Calibri" w:eastAsia="Calibri" w:hAnsi="Calibri" w:cs="Calibri"/>
-              </w:rPr>
-              <w:t>internet_banking</w:t>
-            </w:r>
-            <w:proofErr w:type="spellEnd"/>
-            <w:r>
-              <w:rPr>
-                <w:rFonts w:ascii="Calibri" w:eastAsia="Calibri" w:hAnsi="Calibri" w:cs="Calibri"/>
-              </w:rPr>
-              <w:t xml:space="preserve">, </w:t>
-            </w:r>
-            <w:proofErr w:type="spellStart"/>
-            <w:r>
-              <w:rPr>
-                <w:rFonts w:ascii="Calibri" w:eastAsia="Calibri" w:hAnsi="Calibri" w:cs="Calibri"/>
-              </w:rPr>
-              <w:t>atm_network</w:t>
-            </w:r>
-            <w:proofErr w:type="spellEnd"/>
-            <w:r>
-              <w:rPr>
-                <w:rFonts w:ascii="Calibri" w:eastAsia="Calibri" w:hAnsi="Calibri" w:cs="Calibri"/>
-              </w:rPr>
-              <w:t xml:space="preserve">, </w:t>
-            </w:r>
-            <w:proofErr w:type="spellStart"/>
-            <w:r>
-              <w:rPr>
-                <w:rFonts w:ascii="Calibri" w:eastAsia="Calibri" w:hAnsi="Calibri" w:cs="Calibri"/>
-              </w:rPr>
-              <w:t>agent_banking</w:t>
-            </w:r>
-            <w:proofErr w:type="spellEnd"/>
-            <w:r>
-              <w:rPr>
-                <w:rFonts w:ascii="Calibri" w:eastAsia="Calibri" w:hAnsi="Calibri" w:cs="Calibri"/>
-              </w:rPr>
-              <w:t xml:space="preserve">, </w:t>
-            </w:r>
-            <w:proofErr w:type="spellStart"/>
-            <w:r>
-              <w:rPr>
-                <w:rFonts w:ascii="Calibri" w:eastAsia="Calibri" w:hAnsi="Calibri" w:cs="Calibri"/>
-              </w:rPr>
-              <w:t>card_services</w:t>
-            </w:r>
-            <w:proofErr w:type="spellEnd"/>
-            <w:r>
-              <w:rPr>
-                <w:rFonts w:ascii="Calibri" w:eastAsia="Calibri" w:hAnsi="Calibri" w:cs="Calibri"/>
-              </w:rPr>
-              <w:t xml:space="preserve">, </w:t>
-            </w:r>
-            <w:proofErr w:type="spellStart"/>
-            <w:r>
-              <w:rPr>
-                <w:rFonts w:ascii="Calibri" w:eastAsia="Calibri" w:hAnsi="Calibri" w:cs="Calibri"/>
-              </w:rPr>
-              <w:t>ussd_banking</w:t>
-            </w:r>
-            <w:proofErr w:type="spellEnd"/>
-            <w:r>
-              <w:rPr>
-                <w:rFonts w:ascii="Calibri" w:eastAsia="Calibri" w:hAnsi="Calibri" w:cs="Calibri"/>
-              </w:rPr>
-              <w:t>, other</w:t>
+            <w:r>
+              <w:rPr>
+                <w:rFonts w:ascii="Calibri" w:eastAsia="Calibri" w:hAnsi="Calibri" w:cs="Calibri"/>
+              </w:rPr>
+              <w:t>mobile_banking, internet_banking, atm_network, agent_banking, card_services, ussd_banking, other</w:t>
             </w:r>
           </w:p>
         </w:tc>
       </w:tr>
       <w:tr>
-        <w:tblPrEx>
-          <w:tblCellMar>
-            <w:top w:w="0" w:type="dxa"/>
-            <w:bottom w:w="0" w:type="dxa"/>
-          </w:tblCellMar>
-        </w:tblPrEx>
         <w:tc>
           <w:tcPr>
             <w:tcW w:w="800" w:type="pct"/>
@@ -6649,12 +5536,6 @@
         </w:tc>
       </w:tr>
       <w:tr>
-        <w:tblPrEx>
-          <w:tblCellMar>
-            <w:top w:w="0" w:type="dxa"/>
-            <w:bottom w:w="0" w:type="dxa"/>
-          </w:tblCellMar>
-        </w:tblPrEx>
         <w:tc>
           <w:tcPr>
             <w:tcW w:w="800" w:type="pct"/>
@@ -6786,46 +5667,12 @@
               <w:rPr>
                 <w:rFonts w:ascii="Calibri" w:eastAsia="Calibri" w:hAnsi="Calibri" w:cs="Calibri"/>
               </w:rPr>
-              <w:t xml:space="preserve">chat, </w:t>
-            </w:r>
-            <w:proofErr w:type="spellStart"/>
-            <w:r>
-              <w:rPr>
-                <w:rFonts w:ascii="Calibri" w:eastAsia="Calibri" w:hAnsi="Calibri" w:cs="Calibri"/>
-              </w:rPr>
-              <w:t>ussd</w:t>
-            </w:r>
-            <w:proofErr w:type="spellEnd"/>
-            <w:r>
-              <w:rPr>
-                <w:rFonts w:ascii="Calibri" w:eastAsia="Calibri" w:hAnsi="Calibri" w:cs="Calibri"/>
-              </w:rPr>
-              <w:t xml:space="preserve">, </w:t>
-            </w:r>
-            <w:proofErr w:type="spellStart"/>
-            <w:r>
-              <w:rPr>
-                <w:rFonts w:ascii="Calibri" w:eastAsia="Calibri" w:hAnsi="Calibri" w:cs="Calibri"/>
-              </w:rPr>
-              <w:t>mobile_app</w:t>
-            </w:r>
-            <w:proofErr w:type="spellEnd"/>
-            <w:r>
-              <w:rPr>
-                <w:rFonts w:ascii="Calibri" w:eastAsia="Calibri" w:hAnsi="Calibri" w:cs="Calibri"/>
-              </w:rPr>
-              <w:t xml:space="preserve"> (defaults to chat)</w:t>
+              <w:t>chat, ussd, mobile_app (defaults to chat)</w:t>
             </w:r>
           </w:p>
         </w:tc>
       </w:tr>
       <w:tr>
-        <w:tblPrEx>
-          <w:tblCellMar>
-            <w:top w:w="0" w:type="dxa"/>
-            <w:bottom w:w="0" w:type="dxa"/>
-          </w:tblCellMar>
-        </w:tblPrEx>
         <w:tc>
           <w:tcPr>
             <w:tcW w:w="800" w:type="pct"/>
@@ -6844,14 +5691,12 @@
             <w:vAlign w:val="center"/>
           </w:tcPr>
           <w:p>
-            <w:proofErr w:type="spellStart"/>
             <w:r>
               <w:rPr>
                 <w:rFonts w:ascii="Calibri" w:eastAsia="Calibri" w:hAnsi="Calibri" w:cs="Calibri"/>
               </w:rPr>
               <w:t>suggested_priority</w:t>
             </w:r>
-            <w:proofErr w:type="spellEnd"/>
           </w:p>
         </w:tc>
         <w:tc>
@@ -7000,12 +5845,6 @@
         <w:gridCol w:w="9696"/>
       </w:tblGrid>
       <w:tr>
-        <w:tblPrEx>
-          <w:tblCellMar>
-            <w:top w:w="0" w:type="dxa"/>
-            <w:bottom w:w="0" w:type="dxa"/>
-          </w:tblCellMar>
-        </w:tblPrEx>
         <w:tc>
           <w:tcPr>
             <w:tcW w:w="5000" w:type="pct"/>
@@ -7040,35 +5879,37 @@
                 <w:sz w:val="18"/>
                 <w:szCs w:val="18"/>
               </w:rPr>
-              <w:t xml:space="preserve">  "</w:t>
-            </w:r>
-            <w:proofErr w:type="spellStart"/>
-            <w:proofErr w:type="gramStart"/>
+              <w:t xml:space="preserve">  "customer_id": "CUST-88213",</w:t>
+            </w:r>
+          </w:p>
+          <w:p>
             <w:r>
               <w:rPr>
                 <w:rFonts w:ascii="Consolas" w:eastAsia="Consolas" w:hAnsi="Consolas" w:cs="Consolas"/>
                 <w:sz w:val="18"/>
                 <w:szCs w:val="18"/>
               </w:rPr>
-              <w:t>customer</w:t>
-            </w:r>
-            <w:proofErr w:type="gramEnd"/>
+              <w:t xml:space="preserve">  "category": "mobile_banking",</w:t>
+            </w:r>
+          </w:p>
+          <w:p>
             <w:r>
               <w:rPr>
                 <w:rFonts w:ascii="Consolas" w:eastAsia="Consolas" w:hAnsi="Consolas" w:cs="Consolas"/>
                 <w:sz w:val="18"/>
                 <w:szCs w:val="18"/>
               </w:rPr>
-              <w:t>_id</w:t>
-            </w:r>
-            <w:proofErr w:type="spellEnd"/>
+              <w:t xml:space="preserve">  "description": "Customer states the mobile app has failed to log them in since this morning, tried three times.",</w:t>
+            </w:r>
+          </w:p>
+          <w:p>
             <w:r>
               <w:rPr>
                 <w:rFonts w:ascii="Consolas" w:eastAsia="Consolas" w:hAnsi="Consolas" w:cs="Consolas"/>
                 <w:sz w:val="18"/>
                 <w:szCs w:val="18"/>
               </w:rPr>
-              <w:t>": "CUST-88213",</w:t>
+              <w:t xml:space="preserve">  "channel": "chat",</w:t>
             </w:r>
           </w:p>
           <w:p>
@@ -7078,83 +5919,7 @@
                 <w:sz w:val="18"/>
                 <w:szCs w:val="18"/>
               </w:rPr>
-              <w:t xml:space="preserve">  "category": "</w:t>
-            </w:r>
-            <w:proofErr w:type="spellStart"/>
-            <w:r>
-              <w:rPr>
-                <w:rFonts w:ascii="Consolas" w:eastAsia="Consolas" w:hAnsi="Consolas" w:cs="Consolas"/>
-                <w:sz w:val="18"/>
-                <w:szCs w:val="18"/>
-              </w:rPr>
-              <w:t>mobile_banking</w:t>
-            </w:r>
-            <w:proofErr w:type="spellEnd"/>
-            <w:r>
-              <w:rPr>
-                <w:rFonts w:ascii="Consolas" w:eastAsia="Consolas" w:hAnsi="Consolas" w:cs="Consolas"/>
-                <w:sz w:val="18"/>
-                <w:szCs w:val="18"/>
-              </w:rPr>
-              <w:t>",</w:t>
-            </w:r>
-          </w:p>
-          <w:p>
-            <w:r>
-              <w:rPr>
-                <w:rFonts w:ascii="Consolas" w:eastAsia="Consolas" w:hAnsi="Consolas" w:cs="Consolas"/>
-                <w:sz w:val="18"/>
-                <w:szCs w:val="18"/>
-              </w:rPr>
-              <w:t xml:space="preserve">  "description": "Customer states the mobile app has failed to log them in since this morning, tried three times.",</w:t>
-            </w:r>
-          </w:p>
-          <w:p>
-            <w:r>
-              <w:rPr>
-                <w:rFonts w:ascii="Consolas" w:eastAsia="Consolas" w:hAnsi="Consolas" w:cs="Consolas"/>
-                <w:sz w:val="18"/>
-                <w:szCs w:val="18"/>
-              </w:rPr>
-              <w:t xml:space="preserve">  "channel": "chat",</w:t>
-            </w:r>
-          </w:p>
-          <w:p>
-            <w:r>
-              <w:rPr>
-                <w:rFonts w:ascii="Consolas" w:eastAsia="Consolas" w:hAnsi="Consolas" w:cs="Consolas"/>
-                <w:sz w:val="18"/>
-                <w:szCs w:val="18"/>
-              </w:rPr>
-              <w:t xml:space="preserve">  "</w:t>
-            </w:r>
-            <w:proofErr w:type="spellStart"/>
-            <w:proofErr w:type="gramStart"/>
-            <w:r>
-              <w:rPr>
-                <w:rFonts w:ascii="Consolas" w:eastAsia="Consolas" w:hAnsi="Consolas" w:cs="Consolas"/>
-                <w:sz w:val="18"/>
-                <w:szCs w:val="18"/>
-              </w:rPr>
-              <w:t>suggested</w:t>
-            </w:r>
-            <w:proofErr w:type="gramEnd"/>
-            <w:r>
-              <w:rPr>
-                <w:rFonts w:ascii="Consolas" w:eastAsia="Consolas" w:hAnsi="Consolas" w:cs="Consolas"/>
-                <w:sz w:val="18"/>
-                <w:szCs w:val="18"/>
-              </w:rPr>
-              <w:t>_priority</w:t>
-            </w:r>
-            <w:proofErr w:type="spellEnd"/>
-            <w:r>
-              <w:rPr>
-                <w:rFonts w:ascii="Consolas" w:eastAsia="Consolas" w:hAnsi="Consolas" w:cs="Consolas"/>
-                <w:sz w:val="18"/>
-                <w:szCs w:val="18"/>
-              </w:rPr>
-              <w:t>": "medium"</w:t>
+              <w:t xml:space="preserve">  "suggested_priority": "medium"</w:t>
             </w:r>
           </w:p>
           <w:p>
@@ -7213,12 +5978,6 @@
         <w:gridCol w:w="2521"/>
       </w:tblGrid>
       <w:tr>
-        <w:tblPrEx>
-          <w:tblCellMar>
-            <w:top w:w="0" w:type="dxa"/>
-            <w:bottom w:w="0" w:type="dxa"/>
-          </w:tblCellMar>
-        </w:tblPrEx>
         <w:trPr>
           <w:tblHeader/>
         </w:trPr>
@@ -7344,12 +6103,6 @@
         </w:tc>
       </w:tr>
       <w:tr>
-        <w:tblPrEx>
-          <w:tblCellMar>
-            <w:top w:w="0" w:type="dxa"/>
-            <w:bottom w:w="0" w:type="dxa"/>
-          </w:tblCellMar>
-        </w:tblPrEx>
         <w:tc>
           <w:tcPr>
             <w:tcW w:w="1100" w:type="pct"/>
@@ -7368,14 +6121,12 @@
             <w:vAlign w:val="center"/>
           </w:tcPr>
           <w:p>
-            <w:proofErr w:type="spellStart"/>
             <w:r>
               <w:rPr>
                 <w:rFonts w:ascii="Calibri" w:eastAsia="Calibri" w:hAnsi="Calibri" w:cs="Calibri"/>
               </w:rPr>
               <w:t>status_code</w:t>
             </w:r>
-            <w:proofErr w:type="spellEnd"/>
           </w:p>
         </w:tc>
         <w:tc>
@@ -7458,12 +6209,6 @@
         </w:tc>
       </w:tr>
       <w:tr>
-        <w:tblPrEx>
-          <w:tblCellMar>
-            <w:top w:w="0" w:type="dxa"/>
-            <w:bottom w:w="0" w:type="dxa"/>
-          </w:tblCellMar>
-        </w:tblPrEx>
         <w:tc>
           <w:tcPr>
             <w:tcW w:w="1100" w:type="pct"/>
@@ -7483,14 +6228,12 @@
             <w:vAlign w:val="center"/>
           </w:tcPr>
           <w:p>
-            <w:proofErr w:type="spellStart"/>
             <w:r>
               <w:rPr>
                 <w:rFonts w:ascii="Calibri" w:eastAsia="Calibri" w:hAnsi="Calibri" w:cs="Calibri"/>
               </w:rPr>
               <w:t>ticket_id</w:t>
             </w:r>
-            <w:proofErr w:type="spellEnd"/>
           </w:p>
         </w:tc>
         <w:tc>
@@ -7576,12 +6319,6 @@
         </w:tc>
       </w:tr>
       <w:tr>
-        <w:tblPrEx>
-          <w:tblCellMar>
-            <w:top w:w="0" w:type="dxa"/>
-            <w:bottom w:w="0" w:type="dxa"/>
-          </w:tblCellMar>
-        </w:tblPrEx>
         <w:tc>
           <w:tcPr>
             <w:tcW w:w="1100" w:type="pct"/>
@@ -7688,12 +6425,6 @@
         </w:tc>
       </w:tr>
       <w:tr>
-        <w:tblPrEx>
-          <w:tblCellMar>
-            <w:top w:w="0" w:type="dxa"/>
-            <w:bottom w:w="0" w:type="dxa"/>
-          </w:tblCellMar>
-        </w:tblPrEx>
         <w:tc>
           <w:tcPr>
             <w:tcW w:w="1100" w:type="pct"/>
@@ -7713,14 +6444,12 @@
             <w:vAlign w:val="center"/>
           </w:tcPr>
           <w:p>
-            <w:proofErr w:type="spellStart"/>
             <w:r>
               <w:rPr>
                 <w:rFonts w:ascii="Calibri" w:eastAsia="Calibri" w:hAnsi="Calibri" w:cs="Calibri"/>
               </w:rPr>
               <w:t>created_at</w:t>
             </w:r>
-            <w:proofErr w:type="spellEnd"/>
           </w:p>
         </w:tc>
         <w:tc>
@@ -7806,12 +6535,6 @@
         </w:tc>
       </w:tr>
       <w:tr>
-        <w:tblPrEx>
-          <w:tblCellMar>
-            <w:top w:w="0" w:type="dxa"/>
-            <w:bottom w:w="0" w:type="dxa"/>
-          </w:tblCellMar>
-        </w:tblPrEx>
         <w:tc>
           <w:tcPr>
             <w:tcW w:w="1100" w:type="pct"/>
@@ -7830,14 +6553,12 @@
             <w:vAlign w:val="center"/>
           </w:tcPr>
           <w:p>
-            <w:proofErr w:type="spellStart"/>
             <w:r>
               <w:rPr>
                 <w:rFonts w:ascii="Calibri" w:eastAsia="Calibri" w:hAnsi="Calibri" w:cs="Calibri"/>
               </w:rPr>
               <w:t>confirmation_message</w:t>
             </w:r>
-            <w:proofErr w:type="spellEnd"/>
           </w:p>
         </w:tc>
         <w:tc>
@@ -7960,12 +6681,6 @@
         <w:gridCol w:w="9696"/>
       </w:tblGrid>
       <w:tr>
-        <w:tblPrEx>
-          <w:tblCellMar>
-            <w:top w:w="0" w:type="dxa"/>
-            <w:bottom w:w="0" w:type="dxa"/>
-          </w:tblCellMar>
-        </w:tblPrEx>
         <w:tc>
           <w:tcPr>
             <w:tcW w:w="5000" w:type="pct"/>
@@ -8000,35 +6715,37 @@
                 <w:sz w:val="18"/>
                 <w:szCs w:val="18"/>
               </w:rPr>
-              <w:t xml:space="preserve">  "</w:t>
-            </w:r>
-            <w:proofErr w:type="spellStart"/>
-            <w:proofErr w:type="gramStart"/>
+              <w:t xml:space="preserve">  "status_code": "OK",</w:t>
+            </w:r>
+          </w:p>
+          <w:p>
             <w:r>
               <w:rPr>
                 <w:rFonts w:ascii="Consolas" w:eastAsia="Consolas" w:hAnsi="Consolas" w:cs="Consolas"/>
                 <w:sz w:val="18"/>
                 <w:szCs w:val="18"/>
               </w:rPr>
-              <w:t>status</w:t>
-            </w:r>
-            <w:proofErr w:type="gramEnd"/>
+              <w:t xml:space="preserve">  "ticket_id": "CS-10391",</w:t>
+            </w:r>
+          </w:p>
+          <w:p>
             <w:r>
               <w:rPr>
                 <w:rFonts w:ascii="Consolas" w:eastAsia="Consolas" w:hAnsi="Consolas" w:cs="Consolas"/>
                 <w:sz w:val="18"/>
                 <w:szCs w:val="18"/>
               </w:rPr>
-              <w:t>_code</w:t>
-            </w:r>
-            <w:proofErr w:type="spellEnd"/>
+              <w:t xml:space="preserve">  "status": "open",</w:t>
+            </w:r>
+          </w:p>
+          <w:p>
             <w:r>
               <w:rPr>
                 <w:rFonts w:ascii="Consolas" w:eastAsia="Consolas" w:hAnsi="Consolas" w:cs="Consolas"/>
                 <w:sz w:val="18"/>
                 <w:szCs w:val="18"/>
               </w:rPr>
-              <w:t>": "OK",</w:t>
+              <w:t xml:space="preserve">  "created_at": "2026-09-22T09:05:00Z",</w:t>
             </w:r>
           </w:p>
           <w:p>
@@ -8038,121 +6755,7 @@
                 <w:sz w:val="18"/>
                 <w:szCs w:val="18"/>
               </w:rPr>
-              <w:t xml:space="preserve">  "</w:t>
-            </w:r>
-            <w:proofErr w:type="spellStart"/>
-            <w:proofErr w:type="gramStart"/>
-            <w:r>
-              <w:rPr>
-                <w:rFonts w:ascii="Consolas" w:eastAsia="Consolas" w:hAnsi="Consolas" w:cs="Consolas"/>
-                <w:sz w:val="18"/>
-                <w:szCs w:val="18"/>
-              </w:rPr>
-              <w:t>ticket</w:t>
-            </w:r>
-            <w:proofErr w:type="gramEnd"/>
-            <w:r>
-              <w:rPr>
-                <w:rFonts w:ascii="Consolas" w:eastAsia="Consolas" w:hAnsi="Consolas" w:cs="Consolas"/>
-                <w:sz w:val="18"/>
-                <w:szCs w:val="18"/>
-              </w:rPr>
-              <w:t>_id</w:t>
-            </w:r>
-            <w:proofErr w:type="spellEnd"/>
-            <w:r>
-              <w:rPr>
-                <w:rFonts w:ascii="Consolas" w:eastAsia="Consolas" w:hAnsi="Consolas" w:cs="Consolas"/>
-                <w:sz w:val="18"/>
-                <w:szCs w:val="18"/>
-              </w:rPr>
-              <w:t>": "CS-10391",</w:t>
-            </w:r>
-          </w:p>
-          <w:p>
-            <w:r>
-              <w:rPr>
-                <w:rFonts w:ascii="Consolas" w:eastAsia="Consolas" w:hAnsi="Consolas" w:cs="Consolas"/>
-                <w:sz w:val="18"/>
-                <w:szCs w:val="18"/>
-              </w:rPr>
-              <w:t xml:space="preserve">  "status": "open",</w:t>
-            </w:r>
-          </w:p>
-          <w:p>
-            <w:r>
-              <w:rPr>
-                <w:rFonts w:ascii="Consolas" w:eastAsia="Consolas" w:hAnsi="Consolas" w:cs="Consolas"/>
-                <w:sz w:val="18"/>
-                <w:szCs w:val="18"/>
-              </w:rPr>
-              <w:t xml:space="preserve">  "</w:t>
-            </w:r>
-            <w:proofErr w:type="spellStart"/>
-            <w:proofErr w:type="gramStart"/>
-            <w:r>
-              <w:rPr>
-                <w:rFonts w:ascii="Consolas" w:eastAsia="Consolas" w:hAnsi="Consolas" w:cs="Consolas"/>
-                <w:sz w:val="18"/>
-                <w:szCs w:val="18"/>
-              </w:rPr>
-              <w:t>created</w:t>
-            </w:r>
-            <w:proofErr w:type="gramEnd"/>
-            <w:r>
-              <w:rPr>
-                <w:rFonts w:ascii="Consolas" w:eastAsia="Consolas" w:hAnsi="Consolas" w:cs="Consolas"/>
-                <w:sz w:val="18"/>
-                <w:szCs w:val="18"/>
-              </w:rPr>
-              <w:t>_at</w:t>
-            </w:r>
-            <w:proofErr w:type="spellEnd"/>
-            <w:r>
-              <w:rPr>
-                <w:rFonts w:ascii="Consolas" w:eastAsia="Consolas" w:hAnsi="Consolas" w:cs="Consolas"/>
-                <w:sz w:val="18"/>
-                <w:szCs w:val="18"/>
-              </w:rPr>
-              <w:t>": "2026-09-22T09:05:00Z",</w:t>
-            </w:r>
-          </w:p>
-          <w:p>
-            <w:r>
-              <w:rPr>
-                <w:rFonts w:ascii="Consolas" w:eastAsia="Consolas" w:hAnsi="Consolas" w:cs="Consolas"/>
-                <w:sz w:val="18"/>
-                <w:szCs w:val="18"/>
-              </w:rPr>
-              <w:t xml:space="preserve">  "</w:t>
-            </w:r>
-            <w:proofErr w:type="spellStart"/>
-            <w:proofErr w:type="gramStart"/>
-            <w:r>
-              <w:rPr>
-                <w:rFonts w:ascii="Consolas" w:eastAsia="Consolas" w:hAnsi="Consolas" w:cs="Consolas"/>
-                <w:sz w:val="18"/>
-                <w:szCs w:val="18"/>
-              </w:rPr>
-              <w:t>confirmation</w:t>
-            </w:r>
-            <w:proofErr w:type="gramEnd"/>
-            <w:r>
-              <w:rPr>
-                <w:rFonts w:ascii="Consolas" w:eastAsia="Consolas" w:hAnsi="Consolas" w:cs="Consolas"/>
-                <w:sz w:val="18"/>
-                <w:szCs w:val="18"/>
-              </w:rPr>
-              <w:t>_message</w:t>
-            </w:r>
-            <w:proofErr w:type="spellEnd"/>
-            <w:r>
-              <w:rPr>
-                <w:rFonts w:ascii="Consolas" w:eastAsia="Consolas" w:hAnsi="Consolas" w:cs="Consolas"/>
-                <w:sz w:val="18"/>
-                <w:szCs w:val="18"/>
-              </w:rPr>
-              <w:t>": "Ticket CS-10391 has been created and assigned to the mobile banking support queue."</w:t>
+              <w:t xml:space="preserve">  "confirmation_message": "Ticket CS-10391 has been created and assigned to the mobile banking support queue."</w:t>
             </w:r>
           </w:p>
           <w:p>
@@ -8198,25 +6801,7 @@
           <w:szCs w:val="22"/>
         </w:rPr>
         <w:lastRenderedPageBreak/>
-        <w:t xml:space="preserve">The application layer authenticates the customer (via the existing session) before this tool is invoked; the resulting </w:t>
-      </w:r>
-      <w:proofErr w:type="spellStart"/>
-      <w:r>
-        <w:rPr>
-          <w:rFonts w:ascii="Calibri" w:eastAsia="Calibri" w:hAnsi="Calibri" w:cs="Calibri"/>
-          <w:sz w:val="22"/>
-          <w:szCs w:val="22"/>
-        </w:rPr>
-        <w:t>customer_id</w:t>
-      </w:r>
-      <w:proofErr w:type="spellEnd"/>
-      <w:r>
-        <w:rPr>
-          <w:rFonts w:ascii="Calibri" w:eastAsia="Calibri" w:hAnsi="Calibri" w:cs="Calibri"/>
-          <w:sz w:val="22"/>
-          <w:szCs w:val="22"/>
-        </w:rPr>
-        <w:t xml:space="preserve"> is attached to the ticket automatically, not typed by the customer, preventing a customer from filing a ticket under someone else's identity. No further per-resource authorization is needed since ticket creation only ever acts on the caller's own record. The tool strictly cannot accept fields related to money movement, account status, or credentials — any such parameter is rejected at the schema level.</w:t>
+        <w:t>The application layer authenticates the customer (via the existing session) before this tool is invoked; the resulting customer_id is attached to the ticket automatically, not typed by the customer, preventing a customer from filing a ticket under someone else's identity. No further per-resource authorization is needed since ticket creation only ever acts on the caller's own record. The tool strictly cannot accept fields related to money movement, account status, or credentials — any such parameter is rejected at the schema level.</w:t>
       </w:r>
     </w:p>
     <w:p>
@@ -8230,18 +6815,8 @@
           <w:b/>
           <w:bCs/>
         </w:rPr>
-        <w:t xml:space="preserve">Failure </w:t>
+        <w:t>Failure Behaviour</w:t>
       </w:r>
-      <w:proofErr w:type="spellStart"/>
-      <w:r>
-        <w:rPr>
-          <w:rFonts w:ascii="Calibri" w:eastAsia="Calibri" w:hAnsi="Calibri" w:cs="Calibri"/>
-          <w:b/>
-          <w:bCs/>
-        </w:rPr>
-        <w:t>Behaviour</w:t>
-      </w:r>
-      <w:proofErr w:type="spellEnd"/>
     </w:p>
     <w:tbl>
       <w:tblPr>
@@ -8266,12 +6841,6 @@
         <w:gridCol w:w="4590"/>
       </w:tblGrid>
       <w:tr>
-        <w:tblPrEx>
-          <w:tblCellMar>
-            <w:top w:w="0" w:type="dxa"/>
-            <w:bottom w:w="0" w:type="dxa"/>
-          </w:tblCellMar>
-        </w:tblPrEx>
         <w:trPr>
           <w:tblHeader/>
         </w:trPr>
@@ -8361,29 +6930,12 @@
                 <w:bCs/>
                 <w:color w:val="FFFFFF"/>
               </w:rPr>
-              <w:t xml:space="preserve">Agent </w:t>
-            </w:r>
-            <w:proofErr w:type="spellStart"/>
-            <w:r>
-              <w:rPr>
-                <w:rFonts w:ascii="Calibri" w:eastAsia="Calibri" w:hAnsi="Calibri" w:cs="Calibri"/>
-                <w:b/>
-                <w:bCs/>
-                <w:color w:val="FFFFFF"/>
-              </w:rPr>
-              <w:t>behaviour</w:t>
-            </w:r>
-            <w:proofErr w:type="spellEnd"/>
+              <w:t>Agent behaviour</w:t>
+            </w:r>
           </w:p>
         </w:tc>
       </w:tr>
       <w:tr>
-        <w:tblPrEx>
-          <w:tblCellMar>
-            <w:top w:w="0" w:type="dxa"/>
-            <w:bottom w:w="0" w:type="dxa"/>
-          </w:tblCellMar>
-        </w:tblPrEx>
         <w:tc>
           <w:tcPr>
             <w:tcW w:w="1100" w:type="pct"/>
@@ -8464,12 +7016,6 @@
         </w:tc>
       </w:tr>
       <w:tr>
-        <w:tblPrEx>
-          <w:tblCellMar>
-            <w:top w:w="0" w:type="dxa"/>
-            <w:bottom w:w="0" w:type="dxa"/>
-          </w:tblCellMar>
-        </w:tblPrEx>
         <w:tc>
           <w:tcPr>
             <w:tcW w:w="1100" w:type="pct"/>
@@ -8553,12 +7099,6 @@
         </w:tc>
       </w:tr>
       <w:tr>
-        <w:tblPrEx>
-          <w:tblCellMar>
-            <w:top w:w="0" w:type="dxa"/>
-            <w:bottom w:w="0" w:type="dxa"/>
-          </w:tblCellMar>
-        </w:tblPrEx>
         <w:tc>
           <w:tcPr>
             <w:tcW w:w="1100" w:type="pct"/>
@@ -8639,12 +7179,6 @@
         </w:tc>
       </w:tr>
       <w:tr>
-        <w:tblPrEx>
-          <w:tblCellMar>
-            <w:top w:w="0" w:type="dxa"/>
-            <w:bottom w:w="0" w:type="dxa"/>
-          </w:tblCellMar>
-        </w:tblPrEx>
         <w:tc>
           <w:tcPr>
             <w:tcW w:w="1100" w:type="pct"/>
@@ -8728,12 +7262,6 @@
         </w:tc>
       </w:tr>
       <w:tr>
-        <w:tblPrEx>
-          <w:tblCellMar>
-            <w:top w:w="0" w:type="dxa"/>
-            <w:bottom w:w="0" w:type="dxa"/>
-          </w:tblCellMar>
-        </w:tblPrEx>
         <w:tc>
           <w:tcPr>
             <w:tcW w:w="1100" w:type="pct"/>
@@ -8831,19 +7359,8 @@
           <w:bCs/>
           <w:color w:val="1F3864"/>
         </w:rPr>
-        <w:t xml:space="preserve">Tool 4: </w:t>
+        <w:t>Tool 4: escalate_support_case</w:t>
       </w:r>
-      <w:proofErr w:type="spellStart"/>
-      <w:r>
-        <w:rPr>
-          <w:rFonts w:ascii="Calibri" w:eastAsia="Calibri" w:hAnsi="Calibri" w:cs="Calibri"/>
-          <w:b/>
-          <w:bCs/>
-          <w:color w:val="1F3864"/>
-        </w:rPr>
-        <w:t>escalate_support_case</w:t>
-      </w:r>
-      <w:proofErr w:type="spellEnd"/>
     </w:p>
     <w:p>
       <w:pPr>
@@ -8911,12 +7428,6 @@
         <w:gridCol w:w="2177"/>
       </w:tblGrid>
       <w:tr>
-        <w:tblPrEx>
-          <w:tblCellMar>
-            <w:top w:w="0" w:type="dxa"/>
-            <w:bottom w:w="0" w:type="dxa"/>
-          </w:tblCellMar>
-        </w:tblPrEx>
         <w:trPr>
           <w:tblHeader/>
         </w:trPr>
@@ -9072,12 +7583,6 @@
         </w:tc>
       </w:tr>
       <w:tr>
-        <w:tblPrEx>
-          <w:tblCellMar>
-            <w:top w:w="0" w:type="dxa"/>
-            <w:bottom w:w="0" w:type="dxa"/>
-          </w:tblCellMar>
-        </w:tblPrEx>
         <w:tc>
           <w:tcPr>
             <w:tcW w:w="800" w:type="pct"/>
@@ -9096,14 +7601,12 @@
             <w:vAlign w:val="center"/>
           </w:tcPr>
           <w:p>
-            <w:proofErr w:type="spellStart"/>
             <w:r>
               <w:rPr>
                 <w:rFonts w:ascii="Calibri" w:eastAsia="Calibri" w:hAnsi="Calibri" w:cs="Calibri"/>
               </w:rPr>
               <w:t>case_reference</w:t>
             </w:r>
-            <w:proofErr w:type="spellEnd"/>
           </w:p>
         </w:tc>
         <w:tc>
@@ -9212,12 +7715,6 @@
         </w:tc>
       </w:tr>
       <w:tr>
-        <w:tblPrEx>
-          <w:tblCellMar>
-            <w:top w:w="0" w:type="dxa"/>
-            <w:bottom w:w="0" w:type="dxa"/>
-          </w:tblCellMar>
-        </w:tblPrEx>
         <w:tc>
           <w:tcPr>
             <w:tcW w:w="800" w:type="pct"/>
@@ -9355,12 +7852,6 @@
         </w:tc>
       </w:tr>
       <w:tr>
-        <w:tblPrEx>
-          <w:tblCellMar>
-            <w:top w:w="0" w:type="dxa"/>
-            <w:bottom w:w="0" w:type="dxa"/>
-          </w:tblCellMar>
-        </w:tblPrEx>
         <w:tc>
           <w:tcPr>
             <w:tcW w:w="800" w:type="pct"/>
@@ -9493,12 +7984,6 @@
         </w:tc>
       </w:tr>
       <w:tr>
-        <w:tblPrEx>
-          <w:tblCellMar>
-            <w:top w:w="0" w:type="dxa"/>
-            <w:bottom w:w="0" w:type="dxa"/>
-          </w:tblCellMar>
-        </w:tblPrEx>
         <w:tc>
           <w:tcPr>
             <w:tcW w:w="800" w:type="pct"/>
@@ -9518,14 +8003,12 @@
             <w:vAlign w:val="center"/>
           </w:tcPr>
           <w:p>
-            <w:proofErr w:type="spellStart"/>
             <w:r>
               <w:rPr>
                 <w:rFonts w:ascii="Calibri" w:eastAsia="Calibri" w:hAnsi="Calibri" w:cs="Calibri"/>
               </w:rPr>
               <w:t>human_approval_token</w:t>
             </w:r>
-            <w:proofErr w:type="spellEnd"/>
           </w:p>
         </w:tc>
         <w:tc>
@@ -9678,12 +8161,6 @@
         <w:gridCol w:w="9696"/>
       </w:tblGrid>
       <w:tr>
-        <w:tblPrEx>
-          <w:tblCellMar>
-            <w:top w:w="0" w:type="dxa"/>
-            <w:bottom w:w="0" w:type="dxa"/>
-          </w:tblCellMar>
-        </w:tblPrEx>
         <w:tc>
           <w:tcPr>
             <w:tcW w:w="5000" w:type="pct"/>
@@ -9718,93 +8195,37 @@
                 <w:sz w:val="18"/>
                 <w:szCs w:val="18"/>
               </w:rPr>
-              <w:t xml:space="preserve">  "</w:t>
-            </w:r>
-            <w:proofErr w:type="spellStart"/>
-            <w:proofErr w:type="gramStart"/>
+              <w:t xml:space="preserve">  "case_reference": "CS-10391",</w:t>
+            </w:r>
+          </w:p>
+          <w:p>
             <w:r>
               <w:rPr>
                 <w:rFonts w:ascii="Consolas" w:eastAsia="Consolas" w:hAnsi="Consolas" w:cs="Consolas"/>
                 <w:sz w:val="18"/>
                 <w:szCs w:val="18"/>
               </w:rPr>
-              <w:t>case</w:t>
-            </w:r>
-            <w:proofErr w:type="gramEnd"/>
+              <w:t xml:space="preserve">  "reason": "Customer disputes a transaction and suspects unauthorized account access; outside agent's safe resolution scope.",</w:t>
+            </w:r>
+          </w:p>
+          <w:p>
             <w:r>
               <w:rPr>
                 <w:rFonts w:ascii="Consolas" w:eastAsia="Consolas" w:hAnsi="Consolas" w:cs="Consolas"/>
                 <w:sz w:val="18"/>
                 <w:szCs w:val="18"/>
               </w:rPr>
-              <w:t>_reference</w:t>
-            </w:r>
-            <w:proofErr w:type="spellEnd"/>
+              <w:t xml:space="preserve">  "urgency": "high",</w:t>
+            </w:r>
+          </w:p>
+          <w:p>
             <w:r>
               <w:rPr>
                 <w:rFonts w:ascii="Consolas" w:eastAsia="Consolas" w:hAnsi="Consolas" w:cs="Consolas"/>
                 <w:sz w:val="18"/>
                 <w:szCs w:val="18"/>
               </w:rPr>
-              <w:t>": "CS-10391",</w:t>
-            </w:r>
-          </w:p>
-          <w:p>
-            <w:r>
-              <w:rPr>
-                <w:rFonts w:ascii="Consolas" w:eastAsia="Consolas" w:hAnsi="Consolas" w:cs="Consolas"/>
-                <w:sz w:val="18"/>
-                <w:szCs w:val="18"/>
-              </w:rPr>
-              <w:t xml:space="preserve">  "reason": "Customer disputes a transaction and suspects unauthorized account access; outside agent's safe resolution scope.",</w:t>
-            </w:r>
-          </w:p>
-          <w:p>
-            <w:r>
-              <w:rPr>
-                <w:rFonts w:ascii="Consolas" w:eastAsia="Consolas" w:hAnsi="Consolas" w:cs="Consolas"/>
-                <w:sz w:val="18"/>
-                <w:szCs w:val="18"/>
-              </w:rPr>
-              <w:t xml:space="preserve">  "urgency": "high",</w:t>
-            </w:r>
-          </w:p>
-          <w:p>
-            <w:r>
-              <w:rPr>
-                <w:rFonts w:ascii="Consolas" w:eastAsia="Consolas" w:hAnsi="Consolas" w:cs="Consolas"/>
-                <w:sz w:val="18"/>
-                <w:szCs w:val="18"/>
-              </w:rPr>
-              <w:t xml:space="preserve">  "</w:t>
-            </w:r>
-            <w:proofErr w:type="spellStart"/>
-            <w:proofErr w:type="gramStart"/>
-            <w:r>
-              <w:rPr>
-                <w:rFonts w:ascii="Consolas" w:eastAsia="Consolas" w:hAnsi="Consolas" w:cs="Consolas"/>
-                <w:sz w:val="18"/>
-                <w:szCs w:val="18"/>
-              </w:rPr>
-              <w:t>human</w:t>
-            </w:r>
-            <w:proofErr w:type="gramEnd"/>
-            <w:r>
-              <w:rPr>
-                <w:rFonts w:ascii="Consolas" w:eastAsia="Consolas" w:hAnsi="Consolas" w:cs="Consolas"/>
-                <w:sz w:val="18"/>
-                <w:szCs w:val="18"/>
-              </w:rPr>
-              <w:t>_approval_token</w:t>
-            </w:r>
-            <w:proofErr w:type="spellEnd"/>
-            <w:r>
-              <w:rPr>
-                <w:rFonts w:ascii="Consolas" w:eastAsia="Consolas" w:hAnsi="Consolas" w:cs="Consolas"/>
-                <w:sz w:val="18"/>
-                <w:szCs w:val="18"/>
-              </w:rPr>
-              <w:t>": "APPR-7f2c9a"</w:t>
+              <w:t xml:space="preserve">  "human_approval_token": "APPR-7f2c9a"</w:t>
             </w:r>
           </w:p>
           <w:p>
@@ -9863,12 +8284,6 @@
         <w:gridCol w:w="2521"/>
       </w:tblGrid>
       <w:tr>
-        <w:tblPrEx>
-          <w:tblCellMar>
-            <w:top w:w="0" w:type="dxa"/>
-            <w:bottom w:w="0" w:type="dxa"/>
-          </w:tblCellMar>
-        </w:tblPrEx>
         <w:trPr>
           <w:tblHeader/>
         </w:trPr>
@@ -9994,12 +8409,6 @@
         </w:tc>
       </w:tr>
       <w:tr>
-        <w:tblPrEx>
-          <w:tblCellMar>
-            <w:top w:w="0" w:type="dxa"/>
-            <w:bottom w:w="0" w:type="dxa"/>
-          </w:tblCellMar>
-        </w:tblPrEx>
         <w:tc>
           <w:tcPr>
             <w:tcW w:w="1100" w:type="pct"/>
@@ -10018,14 +8427,12 @@
             <w:vAlign w:val="center"/>
           </w:tcPr>
           <w:p>
-            <w:proofErr w:type="spellStart"/>
             <w:r>
               <w:rPr>
                 <w:rFonts w:ascii="Calibri" w:eastAsia="Calibri" w:hAnsi="Calibri" w:cs="Calibri"/>
               </w:rPr>
               <w:t>status_code</w:t>
             </w:r>
-            <w:proofErr w:type="spellEnd"/>
           </w:p>
         </w:tc>
         <w:tc>
@@ -10108,12 +8515,6 @@
         </w:tc>
       </w:tr>
       <w:tr>
-        <w:tblPrEx>
-          <w:tblCellMar>
-            <w:top w:w="0" w:type="dxa"/>
-            <w:bottom w:w="0" w:type="dxa"/>
-          </w:tblCellMar>
-        </w:tblPrEx>
         <w:tc>
           <w:tcPr>
             <w:tcW w:w="1100" w:type="pct"/>
@@ -10133,14 +8534,12 @@
             <w:vAlign w:val="center"/>
           </w:tcPr>
           <w:p>
-            <w:proofErr w:type="spellStart"/>
             <w:r>
               <w:rPr>
                 <w:rFonts w:ascii="Calibri" w:eastAsia="Calibri" w:hAnsi="Calibri" w:cs="Calibri"/>
               </w:rPr>
               <w:t>escalation_id</w:t>
             </w:r>
-            <w:proofErr w:type="spellEnd"/>
           </w:p>
         </w:tc>
         <w:tc>
@@ -10226,12 +8625,6 @@
         </w:tc>
       </w:tr>
       <w:tr>
-        <w:tblPrEx>
-          <w:tblCellMar>
-            <w:top w:w="0" w:type="dxa"/>
-            <w:bottom w:w="0" w:type="dxa"/>
-          </w:tblCellMar>
-        </w:tblPrEx>
         <w:tc>
           <w:tcPr>
             <w:tcW w:w="1100" w:type="pct"/>
@@ -10328,30 +8721,16 @@
             <w:vAlign w:val="center"/>
           </w:tcPr>
           <w:p>
-            <w:proofErr w:type="spellStart"/>
-            <w:r>
-              <w:rPr>
-                <w:rFonts w:ascii="Calibri" w:eastAsia="Calibri" w:hAnsi="Calibri" w:cs="Calibri"/>
-              </w:rPr>
-              <w:t>pending_approval</w:t>
-            </w:r>
-            <w:proofErr w:type="spellEnd"/>
-            <w:r>
-              <w:rPr>
-                <w:rFonts w:ascii="Calibri" w:eastAsia="Calibri" w:hAnsi="Calibri" w:cs="Calibri"/>
-              </w:rPr>
-              <w:t>, approved, assigned, rejected</w:t>
+            <w:r>
+              <w:rPr>
+                <w:rFonts w:ascii="Calibri" w:eastAsia="Calibri" w:hAnsi="Calibri" w:cs="Calibri"/>
+              </w:rPr>
+              <w:t>pending_approval, approved, assigned, rejected</w:t>
             </w:r>
           </w:p>
         </w:tc>
       </w:tr>
       <w:tr>
-        <w:tblPrEx>
-          <w:tblCellMar>
-            <w:top w:w="0" w:type="dxa"/>
-            <w:bottom w:w="0" w:type="dxa"/>
-          </w:tblCellMar>
-        </w:tblPrEx>
         <w:tc>
           <w:tcPr>
             <w:tcW w:w="1100" w:type="pct"/>
@@ -10371,14 +8750,12 @@
             <w:vAlign w:val="center"/>
           </w:tcPr>
           <w:p>
-            <w:proofErr w:type="spellStart"/>
             <w:r>
               <w:rPr>
                 <w:rFonts w:ascii="Calibri" w:eastAsia="Calibri" w:hAnsi="Calibri" w:cs="Calibri"/>
               </w:rPr>
               <w:t>assigned_to</w:t>
             </w:r>
-            <w:proofErr w:type="spellEnd"/>
           </w:p>
         </w:tc>
         <w:tc>
@@ -10464,12 +8841,6 @@
         </w:tc>
       </w:tr>
       <w:tr>
-        <w:tblPrEx>
-          <w:tblCellMar>
-            <w:top w:w="0" w:type="dxa"/>
-            <w:bottom w:w="0" w:type="dxa"/>
-          </w:tblCellMar>
-        </w:tblPrEx>
         <w:tc>
           <w:tcPr>
             <w:tcW w:w="1100" w:type="pct"/>
@@ -10616,12 +8987,6 @@
         <w:gridCol w:w="9696"/>
       </w:tblGrid>
       <w:tr>
-        <w:tblPrEx>
-          <w:tblCellMar>
-            <w:top w:w="0" w:type="dxa"/>
-            <w:bottom w:w="0" w:type="dxa"/>
-          </w:tblCellMar>
-        </w:tblPrEx>
         <w:tc>
           <w:tcPr>
             <w:tcW w:w="5000" w:type="pct"/>
@@ -10656,121 +9021,37 @@
                 <w:sz w:val="18"/>
                 <w:szCs w:val="18"/>
               </w:rPr>
-              <w:t xml:space="preserve">  "</w:t>
-            </w:r>
-            <w:proofErr w:type="spellStart"/>
-            <w:proofErr w:type="gramStart"/>
+              <w:t xml:space="preserve">  "status_code": "OK",</w:t>
+            </w:r>
+          </w:p>
+          <w:p>
             <w:r>
               <w:rPr>
                 <w:rFonts w:ascii="Consolas" w:eastAsia="Consolas" w:hAnsi="Consolas" w:cs="Consolas"/>
                 <w:sz w:val="18"/>
                 <w:szCs w:val="18"/>
               </w:rPr>
-              <w:t>status</w:t>
-            </w:r>
-            <w:proofErr w:type="gramEnd"/>
+              <w:t xml:space="preserve">  "escalation_id": "ESC-00456",</w:t>
+            </w:r>
+          </w:p>
+          <w:p>
             <w:r>
               <w:rPr>
                 <w:rFonts w:ascii="Consolas" w:eastAsia="Consolas" w:hAnsi="Consolas" w:cs="Consolas"/>
                 <w:sz w:val="18"/>
                 <w:szCs w:val="18"/>
               </w:rPr>
-              <w:t>_code</w:t>
-            </w:r>
-            <w:proofErr w:type="spellEnd"/>
+              <w:t xml:space="preserve">  "status": "assigned",</w:t>
+            </w:r>
+          </w:p>
+          <w:p>
             <w:r>
               <w:rPr>
                 <w:rFonts w:ascii="Consolas" w:eastAsia="Consolas" w:hAnsi="Consolas" w:cs="Consolas"/>
                 <w:sz w:val="18"/>
                 <w:szCs w:val="18"/>
               </w:rPr>
-              <w:t>": "OK",</w:t>
-            </w:r>
-          </w:p>
-          <w:p>
-            <w:r>
-              <w:rPr>
-                <w:rFonts w:ascii="Consolas" w:eastAsia="Consolas" w:hAnsi="Consolas" w:cs="Consolas"/>
-                <w:sz w:val="18"/>
-                <w:szCs w:val="18"/>
-              </w:rPr>
-              <w:t xml:space="preserve">  "</w:t>
-            </w:r>
-            <w:proofErr w:type="spellStart"/>
-            <w:proofErr w:type="gramStart"/>
-            <w:r>
-              <w:rPr>
-                <w:rFonts w:ascii="Consolas" w:eastAsia="Consolas" w:hAnsi="Consolas" w:cs="Consolas"/>
-                <w:sz w:val="18"/>
-                <w:szCs w:val="18"/>
-              </w:rPr>
-              <w:t>escalation</w:t>
-            </w:r>
-            <w:proofErr w:type="gramEnd"/>
-            <w:r>
-              <w:rPr>
-                <w:rFonts w:ascii="Consolas" w:eastAsia="Consolas" w:hAnsi="Consolas" w:cs="Consolas"/>
-                <w:sz w:val="18"/>
-                <w:szCs w:val="18"/>
-              </w:rPr>
-              <w:t>_id</w:t>
-            </w:r>
-            <w:proofErr w:type="spellEnd"/>
-            <w:r>
-              <w:rPr>
-                <w:rFonts w:ascii="Consolas" w:eastAsia="Consolas" w:hAnsi="Consolas" w:cs="Consolas"/>
-                <w:sz w:val="18"/>
-                <w:szCs w:val="18"/>
-              </w:rPr>
-              <w:t>": "ESC-00456",</w:t>
-            </w:r>
-          </w:p>
-          <w:p>
-            <w:r>
-              <w:rPr>
-                <w:rFonts w:ascii="Consolas" w:eastAsia="Consolas" w:hAnsi="Consolas" w:cs="Consolas"/>
-                <w:sz w:val="18"/>
-                <w:szCs w:val="18"/>
-              </w:rPr>
-              <w:t xml:space="preserve">  "status": "assigned",</w:t>
-            </w:r>
-          </w:p>
-          <w:p>
-            <w:r>
-              <w:rPr>
-                <w:rFonts w:ascii="Consolas" w:eastAsia="Consolas" w:hAnsi="Consolas" w:cs="Consolas"/>
-                <w:sz w:val="18"/>
-                <w:szCs w:val="18"/>
-              </w:rPr>
-              <w:t xml:space="preserve">  "</w:t>
-            </w:r>
-            <w:proofErr w:type="spellStart"/>
-            <w:proofErr w:type="gramStart"/>
-            <w:r>
-              <w:rPr>
-                <w:rFonts w:ascii="Consolas" w:eastAsia="Consolas" w:hAnsi="Consolas" w:cs="Consolas"/>
-                <w:sz w:val="18"/>
-                <w:szCs w:val="18"/>
-              </w:rPr>
-              <w:t>assigned</w:t>
-            </w:r>
-            <w:proofErr w:type="gramEnd"/>
-            <w:r>
-              <w:rPr>
-                <w:rFonts w:ascii="Consolas" w:eastAsia="Consolas" w:hAnsi="Consolas" w:cs="Consolas"/>
-                <w:sz w:val="18"/>
-                <w:szCs w:val="18"/>
-              </w:rPr>
-              <w:t>_to</w:t>
-            </w:r>
-            <w:proofErr w:type="spellEnd"/>
-            <w:r>
-              <w:rPr>
-                <w:rFonts w:ascii="Consolas" w:eastAsia="Consolas" w:hAnsi="Consolas" w:cs="Consolas"/>
-                <w:sz w:val="18"/>
-                <w:szCs w:val="18"/>
-              </w:rPr>
-              <w:t>": "Tier 2 Fraud &amp; Disputes Team",</w:t>
+              <w:t xml:space="preserve">  "assigned_to": "Tier 2 Fraud &amp; Disputes Team",</w:t>
             </w:r>
           </w:p>
           <w:p>
@@ -10825,25 +9106,7 @@
           <w:sz w:val="22"/>
           <w:szCs w:val="22"/>
         </w:rPr>
-        <w:t xml:space="preserve">Authentication confirms the requesting customer's identity as usual. Authorization here has an additional layer beyond customer identity: the orchestrator must verify a valid, unexpired </w:t>
-      </w:r>
-      <w:proofErr w:type="spellStart"/>
-      <w:r>
-        <w:rPr>
-          <w:rFonts w:ascii="Calibri" w:eastAsia="Calibri" w:hAnsi="Calibri" w:cs="Calibri"/>
-          <w:sz w:val="22"/>
-          <w:szCs w:val="22"/>
-        </w:rPr>
-        <w:t>human_approval_token</w:t>
-      </w:r>
-      <w:proofErr w:type="spellEnd"/>
-      <w:r>
-        <w:rPr>
-          <w:rFonts w:ascii="Calibri" w:eastAsia="Calibri" w:hAnsi="Calibri" w:cs="Calibri"/>
-          <w:sz w:val="22"/>
-          <w:szCs w:val="22"/>
-        </w:rPr>
-        <w:t xml:space="preserve"> before the escalation tool will execute. Without that token, the call is rejected outright</w:t>
+        <w:t>Authentication confirms the requesting customer's identity as usual. Authorization here has an additional layer beyond customer identity: the orchestrator must verify a valid, unexpired human_approval_token before the escalation tool will execute. Without that token, the call is rejected outright</w:t>
       </w:r>
       <w:r>
         <w:rPr>
@@ -10895,27 +9158,7 @@
           <w:bCs/>
           <w:color w:val="1F3864"/>
         </w:rPr>
-        <w:t xml:space="preserve">Agent identifies need for escalation   →   Human supervisor reviews &amp; approves   →   </w:t>
-      </w:r>
-      <w:proofErr w:type="spellStart"/>
-      <w:r>
-        <w:rPr>
-          <w:rFonts w:ascii="Calibri" w:eastAsia="Calibri" w:hAnsi="Calibri" w:cs="Calibri"/>
-          <w:b/>
-          <w:bCs/>
-          <w:color w:val="1F3864"/>
-        </w:rPr>
-        <w:t>escalate_support_case</w:t>
-      </w:r>
-      <w:proofErr w:type="spellEnd"/>
-      <w:r>
-        <w:rPr>
-          <w:rFonts w:ascii="Calibri" w:eastAsia="Calibri" w:hAnsi="Calibri" w:cs="Calibri"/>
-          <w:b/>
-          <w:bCs/>
-          <w:color w:val="1F3864"/>
-        </w:rPr>
-        <w:t xml:space="preserve"> tool call   →   Result returned to agent   →   Customer informed</w:t>
+        <w:t>Agent identifies need for escalation   →   Human supervisor reviews &amp; approves   →   escalate_support_case tool call   →   Result returned to agent   →   Customer informed</w:t>
       </w:r>
     </w:p>
     <w:p>
@@ -10928,25 +9171,7 @@
           <w:sz w:val="22"/>
           <w:szCs w:val="22"/>
         </w:rPr>
-        <w:t xml:space="preserve">The agent must never tell the customer that an escalation has occurred unless the tool response confirms it with </w:t>
-      </w:r>
-      <w:proofErr w:type="spellStart"/>
-      <w:r>
-        <w:rPr>
-          <w:rFonts w:ascii="Calibri" w:eastAsia="Calibri" w:hAnsi="Calibri" w:cs="Calibri"/>
-          <w:sz w:val="22"/>
-          <w:szCs w:val="22"/>
-        </w:rPr>
-        <w:t>status_code</w:t>
-      </w:r>
-      <w:proofErr w:type="spellEnd"/>
-      <w:r>
-        <w:rPr>
-          <w:rFonts w:ascii="Calibri" w:eastAsia="Calibri" w:hAnsi="Calibri" w:cs="Calibri"/>
-          <w:sz w:val="22"/>
-          <w:szCs w:val="22"/>
-        </w:rPr>
-        <w:t>: OK.</w:t>
+        <w:t>The agent must never tell the customer that an escalation has occurred unless the tool response confirms it with status_code: OK.</w:t>
       </w:r>
     </w:p>
     <w:p>
@@ -10960,18 +9185,8 @@
           <w:b/>
           <w:bCs/>
         </w:rPr>
-        <w:t xml:space="preserve">Failure </w:t>
+        <w:t>Failure Behaviour</w:t>
       </w:r>
-      <w:proofErr w:type="spellStart"/>
-      <w:r>
-        <w:rPr>
-          <w:rFonts w:ascii="Calibri" w:eastAsia="Calibri" w:hAnsi="Calibri" w:cs="Calibri"/>
-          <w:b/>
-          <w:bCs/>
-        </w:rPr>
-        <w:t>Behaviour</w:t>
-      </w:r>
-      <w:proofErr w:type="spellEnd"/>
     </w:p>
     <w:tbl>
       <w:tblPr>
@@ -10996,12 +9211,6 @@
         <w:gridCol w:w="5033"/>
       </w:tblGrid>
       <w:tr>
-        <w:tblPrEx>
-          <w:tblCellMar>
-            <w:top w:w="0" w:type="dxa"/>
-            <w:bottom w:w="0" w:type="dxa"/>
-          </w:tblCellMar>
-        </w:tblPrEx>
         <w:trPr>
           <w:tblHeader/>
         </w:trPr>
@@ -11091,29 +9300,12 @@
                 <w:bCs/>
                 <w:color w:val="FFFFFF"/>
               </w:rPr>
-              <w:t xml:space="preserve">Agent </w:t>
-            </w:r>
-            <w:proofErr w:type="spellStart"/>
-            <w:r>
-              <w:rPr>
-                <w:rFonts w:ascii="Calibri" w:eastAsia="Calibri" w:hAnsi="Calibri" w:cs="Calibri"/>
-                <w:b/>
-                <w:bCs/>
-                <w:color w:val="FFFFFF"/>
-              </w:rPr>
-              <w:t>behaviour</w:t>
-            </w:r>
-            <w:proofErr w:type="spellEnd"/>
+              <w:t>Agent behaviour</w:t>
+            </w:r>
           </w:p>
         </w:tc>
       </w:tr>
       <w:tr>
-        <w:tblPrEx>
-          <w:tblCellMar>
-            <w:top w:w="0" w:type="dxa"/>
-            <w:bottom w:w="0" w:type="dxa"/>
-          </w:tblCellMar>
-        </w:tblPrEx>
         <w:tc>
           <w:tcPr>
             <w:tcW w:w="1100" w:type="pct"/>
@@ -11136,21 +9328,7 @@
               <w:rPr>
                 <w:rFonts w:ascii="Calibri" w:eastAsia="Calibri" w:hAnsi="Calibri" w:cs="Calibri"/>
               </w:rPr>
-              <w:t xml:space="preserve">Missing </w:t>
-            </w:r>
-            <w:proofErr w:type="spellStart"/>
-            <w:r>
-              <w:rPr>
-                <w:rFonts w:ascii="Calibri" w:eastAsia="Calibri" w:hAnsi="Calibri" w:cs="Calibri"/>
-              </w:rPr>
-              <w:t>case_reference</w:t>
-            </w:r>
-            <w:proofErr w:type="spellEnd"/>
-            <w:r>
-              <w:rPr>
-                <w:rFonts w:ascii="Calibri" w:eastAsia="Calibri" w:hAnsi="Calibri" w:cs="Calibri"/>
-              </w:rPr>
-              <w:t>, reason, or urgency</w:t>
+              <w:t>Missing case_reference, reason, or urgency</w:t>
             </w:r>
           </w:p>
         </w:tc>
@@ -11208,12 +9386,6 @@
         </w:tc>
       </w:tr>
       <w:tr>
-        <w:tblPrEx>
-          <w:tblCellMar>
-            <w:top w:w="0" w:type="dxa"/>
-            <w:bottom w:w="0" w:type="dxa"/>
-          </w:tblCellMar>
-        </w:tblPrEx>
         <w:tc>
           <w:tcPr>
             <w:tcW w:w="1100" w:type="pct"/>
@@ -11237,16 +9409,8 @@
               <w:rPr>
                 <w:rFonts w:ascii="Calibri" w:eastAsia="Calibri" w:hAnsi="Calibri" w:cs="Calibri"/>
               </w:rPr>
-              <w:t xml:space="preserve">Missing or invalid </w:t>
-            </w:r>
-            <w:proofErr w:type="spellStart"/>
-            <w:r>
-              <w:rPr>
-                <w:rFonts w:ascii="Calibri" w:eastAsia="Calibri" w:hAnsi="Calibri" w:cs="Calibri"/>
-              </w:rPr>
-              <w:t>human_approval_token</w:t>
-            </w:r>
-            <w:proofErr w:type="spellEnd"/>
+              <w:t>Missing or invalid human_approval_token</w:t>
+            </w:r>
           </w:p>
         </w:tc>
         <w:tc>
@@ -11305,12 +9469,6 @@
         </w:tc>
       </w:tr>
       <w:tr>
-        <w:tblPrEx>
-          <w:tblCellMar>
-            <w:top w:w="0" w:type="dxa"/>
-            <w:bottom w:w="0" w:type="dxa"/>
-          </w:tblCellMar>
-        </w:tblPrEx>
         <w:tc>
           <w:tcPr>
             <w:tcW w:w="1100" w:type="pct"/>
@@ -11391,12 +9549,6 @@
         </w:tc>
       </w:tr>
       <w:tr>
-        <w:tblPrEx>
-          <w:tblCellMar>
-            <w:top w:w="0" w:type="dxa"/>
-            <w:bottom w:w="0" w:type="dxa"/>
-          </w:tblCellMar>
-        </w:tblPrEx>
         <w:tc>
           <w:tcPr>
             <w:tcW w:w="1100" w:type="pct"/>
@@ -11480,12 +9632,6 @@
         </w:tc>
       </w:tr>
       <w:tr>
-        <w:tblPrEx>
-          <w:tblCellMar>
-            <w:top w:w="0" w:type="dxa"/>
-            <w:bottom w:w="0" w:type="dxa"/>
-          </w:tblCellMar>
-        </w:tblPrEx>
         <w:tc>
           <w:tcPr>
             <w:tcW w:w="1100" w:type="pct"/>
@@ -11616,25 +9762,7 @@
           <w:sz w:val="22"/>
           <w:szCs w:val="22"/>
         </w:rPr>
-        <w:t>Retrieve approved, current service-status information (</w:t>
-      </w:r>
-      <w:proofErr w:type="spellStart"/>
-      <w:r>
-        <w:rPr>
-          <w:rFonts w:ascii="Calibri" w:eastAsia="Calibri" w:hAnsi="Calibri" w:cs="Calibri"/>
-          <w:sz w:val="22"/>
-          <w:szCs w:val="22"/>
-        </w:rPr>
-        <w:t>get_service_status</w:t>
-      </w:r>
-      <w:proofErr w:type="spellEnd"/>
-      <w:r>
-        <w:rPr>
-          <w:rFonts w:ascii="Calibri" w:eastAsia="Calibri" w:hAnsi="Calibri" w:cs="Calibri"/>
-          <w:sz w:val="22"/>
-          <w:szCs w:val="22"/>
-        </w:rPr>
-        <w:t>)</w:t>
+        <w:t>Retrieve approved, current service-status information (get_service_status)</w:t>
       </w:r>
     </w:p>
     <w:p>
@@ -11652,25 +9780,7 @@
           <w:sz w:val="22"/>
           <w:szCs w:val="22"/>
         </w:rPr>
-        <w:t>Retrieve support-ticket information the customer is authorized to see (</w:t>
-      </w:r>
-      <w:proofErr w:type="spellStart"/>
-      <w:r>
-        <w:rPr>
-          <w:rFonts w:ascii="Calibri" w:eastAsia="Calibri" w:hAnsi="Calibri" w:cs="Calibri"/>
-          <w:sz w:val="22"/>
-          <w:szCs w:val="22"/>
-        </w:rPr>
-        <w:t>get_ticket_status</w:t>
-      </w:r>
-      <w:proofErr w:type="spellEnd"/>
-      <w:r>
-        <w:rPr>
-          <w:rFonts w:ascii="Calibri" w:eastAsia="Calibri" w:hAnsi="Calibri" w:cs="Calibri"/>
-          <w:sz w:val="22"/>
-          <w:szCs w:val="22"/>
-        </w:rPr>
-        <w:t>)</w:t>
+        <w:t>Retrieve support-ticket information the customer is authorized to see (get_ticket_status)</w:t>
       </w:r>
     </w:p>
     <w:p>
@@ -11688,25 +9798,7 @@
           <w:sz w:val="22"/>
           <w:szCs w:val="22"/>
         </w:rPr>
-        <w:t>Create low-risk support tickets on the customer's own behalf (</w:t>
-      </w:r>
-      <w:proofErr w:type="spellStart"/>
-      <w:r>
-        <w:rPr>
-          <w:rFonts w:ascii="Calibri" w:eastAsia="Calibri" w:hAnsi="Calibri" w:cs="Calibri"/>
-          <w:sz w:val="22"/>
-          <w:szCs w:val="22"/>
-        </w:rPr>
-        <w:t>create_support_ticket</w:t>
-      </w:r>
-      <w:proofErr w:type="spellEnd"/>
-      <w:r>
-        <w:rPr>
-          <w:rFonts w:ascii="Calibri" w:eastAsia="Calibri" w:hAnsi="Calibri" w:cs="Calibri"/>
-          <w:sz w:val="22"/>
-          <w:szCs w:val="22"/>
-        </w:rPr>
-        <w:t>)</w:t>
+        <w:t>Create low-risk support tickets on the customer's own behalf (create_support_ticket)</w:t>
       </w:r>
     </w:p>
     <w:p>
@@ -11742,25 +9834,7 @@
           <w:sz w:val="22"/>
           <w:szCs w:val="22"/>
         </w:rPr>
-        <w:t>Submit escalations that have already received human approval (</w:t>
-      </w:r>
-      <w:proofErr w:type="spellStart"/>
-      <w:r>
-        <w:rPr>
-          <w:rFonts w:ascii="Calibri" w:eastAsia="Calibri" w:hAnsi="Calibri" w:cs="Calibri"/>
-          <w:sz w:val="22"/>
-          <w:szCs w:val="22"/>
-        </w:rPr>
-        <w:t>escalate_support_case</w:t>
-      </w:r>
-      <w:proofErr w:type="spellEnd"/>
-      <w:r>
-        <w:rPr>
-          <w:rFonts w:ascii="Calibri" w:eastAsia="Calibri" w:hAnsi="Calibri" w:cs="Calibri"/>
-          <w:sz w:val="22"/>
-          <w:szCs w:val="22"/>
-        </w:rPr>
-        <w:t>)</w:t>
+        <w:t>Submit escalations that have already received human approval (escalate_support_case)</w:t>
       </w:r>
     </w:p>
     <w:p>
@@ -11994,12 +10068,6 @@
         <w:gridCol w:w="5818"/>
       </w:tblGrid>
       <w:tr>
-        <w:tblPrEx>
-          <w:tblCellMar>
-            <w:top w:w="0" w:type="dxa"/>
-            <w:bottom w:w="0" w:type="dxa"/>
-          </w:tblCellMar>
-        </w:tblPrEx>
         <w:trPr>
           <w:tblHeader/>
         </w:trPr>
@@ -12065,12 +10133,6 @@
         </w:tc>
       </w:tr>
       <w:tr>
-        <w:tblPrEx>
-          <w:tblCellMar>
-            <w:top w:w="0" w:type="dxa"/>
-            <w:bottom w:w="0" w:type="dxa"/>
-          </w:tblCellMar>
-        </w:tblPrEx>
         <w:tc>
           <w:tcPr>
             <w:tcW w:w="2000" w:type="pct"/>
@@ -12119,68 +10181,12 @@
               <w:rPr>
                 <w:rFonts w:ascii="Calibri" w:eastAsia="Calibri" w:hAnsi="Calibri" w:cs="Calibri"/>
               </w:rPr>
-              <w:t xml:space="preserve">Four tools defined: </w:t>
-            </w:r>
-            <w:proofErr w:type="spellStart"/>
-            <w:r>
-              <w:rPr>
-                <w:rFonts w:ascii="Calibri" w:eastAsia="Calibri" w:hAnsi="Calibri" w:cs="Calibri"/>
-              </w:rPr>
-              <w:t>get_service_status</w:t>
-            </w:r>
-            <w:proofErr w:type="spellEnd"/>
-            <w:r>
-              <w:rPr>
-                <w:rFonts w:ascii="Calibri" w:eastAsia="Calibri" w:hAnsi="Calibri" w:cs="Calibri"/>
-              </w:rPr>
-              <w:t xml:space="preserve">, </w:t>
-            </w:r>
-            <w:proofErr w:type="spellStart"/>
-            <w:r>
-              <w:rPr>
-                <w:rFonts w:ascii="Calibri" w:eastAsia="Calibri" w:hAnsi="Calibri" w:cs="Calibri"/>
-              </w:rPr>
-              <w:t>get_ticket_status</w:t>
-            </w:r>
-            <w:proofErr w:type="spellEnd"/>
-            <w:r>
-              <w:rPr>
-                <w:rFonts w:ascii="Calibri" w:eastAsia="Calibri" w:hAnsi="Calibri" w:cs="Calibri"/>
-              </w:rPr>
-              <w:t xml:space="preserve">, </w:t>
-            </w:r>
-            <w:proofErr w:type="spellStart"/>
-            <w:r>
-              <w:rPr>
-                <w:rFonts w:ascii="Calibri" w:eastAsia="Calibri" w:hAnsi="Calibri" w:cs="Calibri"/>
-              </w:rPr>
-              <w:t>create_support_ticket</w:t>
-            </w:r>
-            <w:proofErr w:type="spellEnd"/>
-            <w:r>
-              <w:rPr>
-                <w:rFonts w:ascii="Calibri" w:eastAsia="Calibri" w:hAnsi="Calibri" w:cs="Calibri"/>
-              </w:rPr>
-              <w:t xml:space="preserve">, </w:t>
-            </w:r>
-            <w:proofErr w:type="spellStart"/>
-            <w:r>
-              <w:rPr>
-                <w:rFonts w:ascii="Calibri" w:eastAsia="Calibri" w:hAnsi="Calibri" w:cs="Calibri"/>
-              </w:rPr>
-              <w:t>escalate_support_case</w:t>
-            </w:r>
-            <w:proofErr w:type="spellEnd"/>
+              <w:t>Four tools defined: get_service_status, get_ticket_status, create_support_ticket, escalate_support_case</w:t>
+            </w:r>
           </w:p>
         </w:tc>
       </w:tr>
       <w:tr>
-        <w:tblPrEx>
-          <w:tblCellMar>
-            <w:top w:w="0" w:type="dxa"/>
-            <w:bottom w:w="0" w:type="dxa"/>
-          </w:tblCellMar>
-        </w:tblPrEx>
         <w:tc>
           <w:tcPr>
             <w:tcW w:w="2000" w:type="pct"/>
@@ -12237,12 +10243,6 @@
         </w:tc>
       </w:tr>
       <w:tr>
-        <w:tblPrEx>
-          <w:tblCellMar>
-            <w:top w:w="0" w:type="dxa"/>
-            <w:bottom w:w="0" w:type="dxa"/>
-          </w:tblCellMar>
-        </w:tblPrEx>
         <w:tc>
           <w:tcPr>
             <w:tcW w:w="2000" w:type="pct"/>
@@ -12297,12 +10297,6 @@
         </w:tc>
       </w:tr>
       <w:tr>
-        <w:tblPrEx>
-          <w:tblCellMar>
-            <w:top w:w="0" w:type="dxa"/>
-            <w:bottom w:w="0" w:type="dxa"/>
-          </w:tblCellMar>
-        </w:tblPrEx>
         <w:tc>
           <w:tcPr>
             <w:tcW w:w="2000" w:type="pct"/>
@@ -12359,12 +10353,6 @@
         </w:tc>
       </w:tr>
       <w:tr>
-        <w:tblPrEx>
-          <w:tblCellMar>
-            <w:top w:w="0" w:type="dxa"/>
-            <w:bottom w:w="0" w:type="dxa"/>
-          </w:tblCellMar>
-        </w:tblPrEx>
         <w:tc>
           <w:tcPr>
             <w:tcW w:w="2000" w:type="pct"/>
@@ -12419,12 +10407,6 @@
         </w:tc>
       </w:tr>
       <w:tr>
-        <w:tblPrEx>
-          <w:tblCellMar>
-            <w:top w:w="0" w:type="dxa"/>
-            <w:bottom w:w="0" w:type="dxa"/>
-          </w:tblCellMar>
-        </w:tblPrEx>
         <w:tc>
           <w:tcPr>
             <w:tcW w:w="2000" w:type="pct"/>
@@ -12448,21 +10430,7 @@
               <w:rPr>
                 <w:rFonts w:ascii="Calibri" w:eastAsia="Calibri" w:hAnsi="Calibri" w:cs="Calibri"/>
               </w:rPr>
-              <w:t xml:space="preserve">Failure </w:t>
-            </w:r>
-            <w:proofErr w:type="spellStart"/>
-            <w:r>
-              <w:rPr>
-                <w:rFonts w:ascii="Calibri" w:eastAsia="Calibri" w:hAnsi="Calibri" w:cs="Calibri"/>
-              </w:rPr>
-              <w:t>behaviour</w:t>
-            </w:r>
-            <w:proofErr w:type="spellEnd"/>
-            <w:r>
-              <w:rPr>
-                <w:rFonts w:ascii="Calibri" w:eastAsia="Calibri" w:hAnsi="Calibri" w:cs="Calibri"/>
-              </w:rPr>
-              <w:t xml:space="preserve"> defined</w:t>
+              <w:t>Failure behaviour defined</w:t>
             </w:r>
           </w:p>
         </w:tc>
@@ -12489,32 +10457,12 @@
               <w:rPr>
                 <w:rFonts w:ascii="Calibri" w:eastAsia="Calibri" w:hAnsi="Calibri" w:cs="Calibri"/>
               </w:rPr>
-              <w:t xml:space="preserve">“Failure </w:t>
-            </w:r>
-            <w:proofErr w:type="spellStart"/>
-            <w:r>
-              <w:rPr>
-                <w:rFonts w:ascii="Calibri" w:eastAsia="Calibri" w:hAnsi="Calibri" w:cs="Calibri"/>
-              </w:rPr>
-              <w:t>Behaviour</w:t>
-            </w:r>
-            <w:proofErr w:type="spellEnd"/>
-            <w:r>
-              <w:rPr>
-                <w:rFonts w:ascii="Calibri" w:eastAsia="Calibri" w:hAnsi="Calibri" w:cs="Calibri"/>
-              </w:rPr>
-              <w:t>” table per tool, using structured error codes</w:t>
+              <w:t>“Failure Behaviour” table per tool, using structured error codes</w:t>
             </w:r>
           </w:p>
         </w:tc>
       </w:tr>
       <w:tr>
-        <w:tblPrEx>
-          <w:tblCellMar>
-            <w:top w:w="0" w:type="dxa"/>
-            <w:bottom w:w="0" w:type="dxa"/>
-          </w:tblCellMar>
-        </w:tblPrEx>
         <w:tc>
           <w:tcPr>
             <w:tcW w:w="2000" w:type="pct"/>
@@ -12559,58 +10507,16 @@
             <w:vAlign w:val="center"/>
           </w:tcPr>
           <w:p>
-            <w:proofErr w:type="spellStart"/>
-            <w:r>
-              <w:rPr>
-                <w:rFonts w:ascii="Calibri" w:eastAsia="Calibri" w:hAnsi="Calibri" w:cs="Calibri"/>
-              </w:rPr>
-              <w:t>get_service_status</w:t>
-            </w:r>
-            <w:proofErr w:type="spellEnd"/>
-            <w:r>
-              <w:rPr>
-                <w:rFonts w:ascii="Calibri" w:eastAsia="Calibri" w:hAnsi="Calibri" w:cs="Calibri"/>
-              </w:rPr>
-              <w:t xml:space="preserve"> / </w:t>
-            </w:r>
-            <w:proofErr w:type="spellStart"/>
-            <w:r>
-              <w:rPr>
-                <w:rFonts w:ascii="Calibri" w:eastAsia="Calibri" w:hAnsi="Calibri" w:cs="Calibri"/>
-              </w:rPr>
-              <w:t>get_ticket_status</w:t>
-            </w:r>
-            <w:proofErr w:type="spellEnd"/>
-            <w:r>
-              <w:rPr>
-                <w:rFonts w:ascii="Calibri" w:eastAsia="Calibri" w:hAnsi="Calibri" w:cs="Calibri"/>
-              </w:rPr>
-              <w:t xml:space="preserve"> (current data); </w:t>
-            </w:r>
-            <w:proofErr w:type="spellStart"/>
-            <w:r>
-              <w:rPr>
-                <w:rFonts w:ascii="Calibri" w:eastAsia="Calibri" w:hAnsi="Calibri" w:cs="Calibri"/>
-              </w:rPr>
-              <w:t>create_support_ticket</w:t>
-            </w:r>
-            <w:proofErr w:type="spellEnd"/>
-            <w:r>
-              <w:rPr>
-                <w:rFonts w:ascii="Calibri" w:eastAsia="Calibri" w:hAnsi="Calibri" w:cs="Calibri"/>
-              </w:rPr>
-              <w:t xml:space="preserve"> (low-risk simulated side effect)</w:t>
+            <w:r>
+              <w:rPr>
+                <w:rFonts w:ascii="Calibri" w:eastAsia="Calibri" w:hAnsi="Calibri" w:cs="Calibri"/>
+              </w:rPr>
+              <w:t>get_service_status / get_ticket_status (current data); create_support_ticket (low-risk simulated side effect)</w:t>
             </w:r>
           </w:p>
         </w:tc>
       </w:tr>
       <w:tr>
-        <w:tblPrEx>
-          <w:tblCellMar>
-            <w:top w:w="0" w:type="dxa"/>
-            <w:bottom w:w="0" w:type="dxa"/>
-          </w:tblCellMar>
-        </w:tblPrEx>
         <w:tc>
           <w:tcPr>
             <w:tcW w:w="2000" w:type="pct"/>
@@ -12662,32 +10568,12 @@
               <w:rPr>
                 <w:rFonts w:ascii="Calibri" w:eastAsia="Calibri" w:hAnsi="Calibri" w:cs="Calibri"/>
               </w:rPr>
-              <w:t xml:space="preserve">Covered in every tool's Failure </w:t>
-            </w:r>
-            <w:proofErr w:type="spellStart"/>
-            <w:r>
-              <w:rPr>
-                <w:rFonts w:ascii="Calibri" w:eastAsia="Calibri" w:hAnsi="Calibri" w:cs="Calibri"/>
-              </w:rPr>
-              <w:t>Behaviour</w:t>
-            </w:r>
-            <w:proofErr w:type="spellEnd"/>
-            <w:r>
-              <w:rPr>
-                <w:rFonts w:ascii="Calibri" w:eastAsia="Calibri" w:hAnsi="Calibri" w:cs="Calibri"/>
-              </w:rPr>
-              <w:t xml:space="preserve"> table via INVALID_INPUT, UNAUTHORIZED, SERVICE_UNAVAILABLE, INVALID_TOOL_RESPONSE</w:t>
+              <w:t>Covered in every tool's Failure Behaviour table via INVALID_INPUT, UNAUTHORIZED, SERVICE_UNAVAILABLE, INVALID_TOOL_RESPONSE</w:t>
             </w:r>
           </w:p>
         </w:tc>
       </w:tr>
       <w:tr>
-        <w:tblPrEx>
-          <w:tblCellMar>
-            <w:top w:w="0" w:type="dxa"/>
-            <w:bottom w:w="0" w:type="dxa"/>
-          </w:tblCellMar>
-        </w:tblPrEx>
         <w:tc>
           <w:tcPr>
             <w:tcW w:w="2000" w:type="pct"/>
@@ -12732,33 +10618,17 @@
             <w:vAlign w:val="center"/>
           </w:tcPr>
           <w:p>
-            <w:proofErr w:type="spellStart"/>
-            <w:r>
-              <w:rPr>
-                <w:rFonts w:ascii="Calibri" w:eastAsia="Calibri" w:hAnsi="Calibri" w:cs="Calibri"/>
-              </w:rPr>
-              <w:t>escalate_support_case</w:t>
-            </w:r>
-            <w:proofErr w:type="spellEnd"/>
-            <w:r>
-              <w:rPr>
-                <w:rFonts w:ascii="Calibri" w:eastAsia="Calibri" w:hAnsi="Calibri" w:cs="Calibri"/>
-              </w:rPr>
-              <w:t xml:space="preserve"> requires a </w:t>
-            </w:r>
-            <w:proofErr w:type="spellStart"/>
-            <w:r>
-              <w:rPr>
-                <w:rFonts w:ascii="Calibri" w:eastAsia="Calibri" w:hAnsi="Calibri" w:cs="Calibri"/>
-              </w:rPr>
-              <w:t>human_approval_token</w:t>
-            </w:r>
-            <w:proofErr w:type="spellEnd"/>
-            <w:r>
-              <w:rPr>
-                <w:rFonts w:ascii="Calibri" w:eastAsia="Calibri" w:hAnsi="Calibri" w:cs="Calibri"/>
-              </w:rPr>
-              <w:t>; agent cannot self-approve or claim success without tool confirmation</w:t>
+            <w:r>
+              <w:rPr>
+                <w:rFonts w:ascii="Calibri" w:eastAsia="Calibri" w:hAnsi="Calibri" w:cs="Calibri"/>
+              </w:rPr>
+              <w:t>escalate_support_case requires a human_approval_token; agent cannot self-approve or claim success without tool confirmation</w:t>
+            </w:r>
+            <w:r>
+              <w:rPr>
+                <w:rFonts w:ascii="Calibri" w:eastAsia="Calibri" w:hAnsi="Calibri" w:cs="Calibri"/>
+              </w:rPr>
+              <w:t>.</w:t>
             </w:r>
           </w:p>
         </w:tc>

</xml_diff>